<commit_message>
docs: add system requirements and project modules
Added system users, functional requirements, non-functional requirements, and main system modules.
</commit_message>
<xml_diff>
--- a/Student_Management_System_Project_SRS.docx
+++ b/Student_Management_System_Project_SRS.docx
@@ -74,20 +74,7 @@
           <w:szCs w:val="24"/>
           <w:lang w:eastAsia="en-GB"/>
         </w:rPr>
-        <w:t>Student Management Syst</w:t>
-      </w:r>
-      <w:bookmarkStart w:id="0" w:name="_GoBack"/>
-      <w:bookmarkEnd w:id="0"/>
-      <w:r>
-        <w:rPr>
-          <w:rFonts w:ascii="Times New Roman" w:eastAsia="Times New Roman" w:hAnsi="Times New Roman" w:cs="Times New Roman"/>
-          <w:b/>
-          <w:bCs/>
-          <w:sz w:val="24"/>
-          <w:szCs w:val="24"/>
-          <w:lang w:eastAsia="en-GB"/>
-        </w:rPr>
-        <w:t>em</w:t>
+        <w:t>Student Management System</w:t>
       </w:r>
     </w:p>
     <w:p>
@@ -433,7 +420,1585 @@
         <w:t>Version Control: Git and GitHub</w:t>
       </w:r>
     </w:p>
-    <w:p/>
+    <w:p>
+      <w:pPr>
+        <w:pStyle w:val="Heading2"/>
+      </w:pPr>
+      <w:r>
+        <w:t>5. System Users</w:t>
+      </w:r>
+    </w:p>
+    <w:p>
+      <w:pPr>
+        <w:pStyle w:val="NormalWeb"/>
+      </w:pPr>
+      <w:proofErr w:type="gramStart"/>
+      <w:r>
+        <w:t>The Student Management System will primarily be managed by an authorized administrator</w:t>
+      </w:r>
+      <w:proofErr w:type="gramEnd"/>
+      <w:r>
+        <w:t xml:space="preserve">. The administrator will have access to all major system modules and will be responsible for managing student records, courses, </w:t>
+      </w:r>
+      <w:proofErr w:type="spellStart"/>
+      <w:r>
+        <w:t>enrollments</w:t>
+      </w:r>
+      <w:proofErr w:type="spellEnd"/>
+      <w:r>
+        <w:t>, attendance, grades, reports, and dashboard information.</w:t>
+      </w:r>
+    </w:p>
+    <w:p>
+      <w:pPr>
+        <w:pStyle w:val="Heading3"/>
+        <w:rPr>
+          <w:rFonts w:ascii="Times New Roman" w:hAnsi="Times New Roman" w:cs="Times New Roman"/>
+          <w:b/>
+          <w:color w:val="auto"/>
+        </w:rPr>
+      </w:pPr>
+      <w:r>
+        <w:rPr>
+          <w:rFonts w:ascii="Times New Roman" w:hAnsi="Times New Roman" w:cs="Times New Roman"/>
+          <w:b/>
+          <w:color w:val="auto"/>
+        </w:rPr>
+        <w:t>5.1 Administrator</w:t>
+      </w:r>
+    </w:p>
+    <w:p>
+      <w:pPr>
+        <w:pStyle w:val="NormalWeb"/>
+      </w:pPr>
+      <w:r>
+        <w:t xml:space="preserve">The Administrator will be responsible </w:t>
+      </w:r>
+      <w:proofErr w:type="gramStart"/>
+      <w:r>
+        <w:t>for</w:t>
+      </w:r>
+      <w:proofErr w:type="gramEnd"/>
+      <w:r>
+        <w:t>:</w:t>
+      </w:r>
+    </w:p>
+    <w:p>
+      <w:pPr>
+        <w:numPr>
+          <w:ilvl w:val="0"/>
+          <w:numId w:val="2"/>
+        </w:numPr>
+        <w:spacing w:before="100" w:beforeAutospacing="1" w:after="100" w:afterAutospacing="1" w:line="240" w:lineRule="auto"/>
+      </w:pPr>
+      <w:r>
+        <w:t xml:space="preserve">Adding, viewing, updating, and deleting student records. </w:t>
+      </w:r>
+    </w:p>
+    <w:p>
+      <w:pPr>
+        <w:numPr>
+          <w:ilvl w:val="0"/>
+          <w:numId w:val="2"/>
+        </w:numPr>
+        <w:spacing w:before="100" w:beforeAutospacing="1" w:after="100" w:afterAutospacing="1" w:line="240" w:lineRule="auto"/>
+      </w:pPr>
+      <w:r>
+        <w:t xml:space="preserve">Creating, viewing, updating, and deleting courses. </w:t>
+      </w:r>
+    </w:p>
+    <w:p>
+      <w:pPr>
+        <w:numPr>
+          <w:ilvl w:val="0"/>
+          <w:numId w:val="2"/>
+        </w:numPr>
+        <w:spacing w:before="100" w:beforeAutospacing="1" w:after="100" w:afterAutospacing="1" w:line="240" w:lineRule="auto"/>
+      </w:pPr>
+      <w:r>
+        <w:t xml:space="preserve">Enrolling students in courses. </w:t>
+      </w:r>
+    </w:p>
+    <w:p>
+      <w:pPr>
+        <w:numPr>
+          <w:ilvl w:val="0"/>
+          <w:numId w:val="2"/>
+        </w:numPr>
+        <w:spacing w:before="100" w:beforeAutospacing="1" w:after="100" w:afterAutospacing="1" w:line="240" w:lineRule="auto"/>
+      </w:pPr>
+      <w:r>
+        <w:t xml:space="preserve">Recording and managing student attendance. </w:t>
+      </w:r>
+    </w:p>
+    <w:p>
+      <w:pPr>
+        <w:numPr>
+          <w:ilvl w:val="0"/>
+          <w:numId w:val="2"/>
+        </w:numPr>
+        <w:spacing w:before="100" w:beforeAutospacing="1" w:after="100" w:afterAutospacing="1" w:line="240" w:lineRule="auto"/>
+      </w:pPr>
+      <w:r>
+        <w:lastRenderedPageBreak/>
+        <w:t xml:space="preserve">Marking attendance as </w:t>
+      </w:r>
+      <w:r>
+        <w:rPr>
+          <w:rStyle w:val="Strong"/>
+        </w:rPr>
+        <w:t xml:space="preserve">Present, </w:t>
+      </w:r>
+      <w:proofErr w:type="gramStart"/>
+      <w:r>
+        <w:rPr>
+          <w:rStyle w:val="Strong"/>
+        </w:rPr>
+        <w:t>Absent</w:t>
+      </w:r>
+      <w:proofErr w:type="gramEnd"/>
+      <w:r>
+        <w:rPr>
+          <w:rStyle w:val="Strong"/>
+        </w:rPr>
+        <w:t>, or Excused</w:t>
+      </w:r>
+      <w:r>
+        <w:t xml:space="preserve">. </w:t>
+      </w:r>
+    </w:p>
+    <w:p>
+      <w:pPr>
+        <w:numPr>
+          <w:ilvl w:val="0"/>
+          <w:numId w:val="2"/>
+        </w:numPr>
+        <w:spacing w:before="100" w:beforeAutospacing="1" w:after="100" w:afterAutospacing="1" w:line="240" w:lineRule="auto"/>
+      </w:pPr>
+      <w:r>
+        <w:t xml:space="preserve">Adding, updating, and viewing student grades. </w:t>
+      </w:r>
+    </w:p>
+    <w:p>
+      <w:pPr>
+        <w:numPr>
+          <w:ilvl w:val="0"/>
+          <w:numId w:val="2"/>
+        </w:numPr>
+        <w:spacing w:before="100" w:beforeAutospacing="1" w:after="100" w:afterAutospacing="1" w:line="240" w:lineRule="auto"/>
+      </w:pPr>
+      <w:r>
+        <w:t xml:space="preserve">Viewing academic information through the admin dashboard. </w:t>
+      </w:r>
+    </w:p>
+    <w:p>
+      <w:pPr>
+        <w:numPr>
+          <w:ilvl w:val="0"/>
+          <w:numId w:val="2"/>
+        </w:numPr>
+        <w:spacing w:before="100" w:beforeAutospacing="1" w:after="100" w:afterAutospacing="1" w:line="240" w:lineRule="auto"/>
+      </w:pPr>
+      <w:r>
+        <w:t xml:space="preserve">Generating and reviewing student-related reports. </w:t>
+      </w:r>
+    </w:p>
+    <w:p>
+      <w:pPr>
+        <w:pStyle w:val="NormalWeb"/>
+      </w:pPr>
+      <w:r>
+        <w:t xml:space="preserve">Note: </w:t>
+      </w:r>
+      <w:proofErr w:type="spellStart"/>
+      <w:r>
+        <w:t>Abhi</w:t>
+      </w:r>
+      <w:proofErr w:type="spellEnd"/>
+      <w:r>
+        <w:t xml:space="preserve"> hum system </w:t>
+      </w:r>
+      <w:proofErr w:type="spellStart"/>
+      <w:proofErr w:type="gramStart"/>
+      <w:r>
+        <w:t>ko</w:t>
+      </w:r>
+      <w:proofErr w:type="spellEnd"/>
+      <w:proofErr w:type="gramEnd"/>
+      <w:r>
+        <w:t xml:space="preserve"> </w:t>
+      </w:r>
+      <w:r>
+        <w:rPr>
+          <w:rStyle w:val="Strong"/>
+        </w:rPr>
+        <w:t>single-admin system</w:t>
+      </w:r>
+      <w:r>
+        <w:t xml:space="preserve"> </w:t>
+      </w:r>
+      <w:proofErr w:type="spellStart"/>
+      <w:r>
+        <w:t>rakhenge</w:t>
+      </w:r>
+      <w:proofErr w:type="spellEnd"/>
+      <w:r>
+        <w:t xml:space="preserve">. </w:t>
+      </w:r>
+      <w:proofErr w:type="spellStart"/>
+      <w:r>
+        <w:t>Isse</w:t>
+      </w:r>
+      <w:proofErr w:type="spellEnd"/>
+      <w:r>
+        <w:t xml:space="preserve"> project manageable, clean </w:t>
+      </w:r>
+      <w:proofErr w:type="spellStart"/>
+      <w:r>
+        <w:t>aur</w:t>
+      </w:r>
+      <w:proofErr w:type="spellEnd"/>
+      <w:r>
+        <w:t xml:space="preserve"> 1-month timeline </w:t>
+      </w:r>
+      <w:proofErr w:type="spellStart"/>
+      <w:r>
+        <w:t>ke</w:t>
+      </w:r>
+      <w:proofErr w:type="spellEnd"/>
+      <w:r>
+        <w:t xml:space="preserve"> </w:t>
+      </w:r>
+      <w:proofErr w:type="spellStart"/>
+      <w:r>
+        <w:t>andar</w:t>
+      </w:r>
+      <w:proofErr w:type="spellEnd"/>
+      <w:r>
+        <w:t xml:space="preserve"> realistic </w:t>
+      </w:r>
+      <w:proofErr w:type="spellStart"/>
+      <w:r>
+        <w:t>rahega</w:t>
+      </w:r>
+      <w:proofErr w:type="spellEnd"/>
+      <w:r>
+        <w:t xml:space="preserve">. </w:t>
+      </w:r>
+      <w:proofErr w:type="spellStart"/>
+      <w:r>
+        <w:t>Baad</w:t>
+      </w:r>
+      <w:proofErr w:type="spellEnd"/>
+      <w:r>
+        <w:t xml:space="preserve"> </w:t>
+      </w:r>
+      <w:proofErr w:type="spellStart"/>
+      <w:r>
+        <w:t>mein</w:t>
+      </w:r>
+      <w:proofErr w:type="spellEnd"/>
+      <w:r>
+        <w:t xml:space="preserve"> agar requirement </w:t>
+      </w:r>
+      <w:proofErr w:type="spellStart"/>
+      <w:r>
+        <w:t>aaye</w:t>
+      </w:r>
+      <w:proofErr w:type="spellEnd"/>
+      <w:r>
+        <w:t xml:space="preserve"> to teacher/student login add </w:t>
+      </w:r>
+      <w:proofErr w:type="spellStart"/>
+      <w:r>
+        <w:t>kiya</w:t>
+      </w:r>
+      <w:proofErr w:type="spellEnd"/>
+      <w:r>
+        <w:t xml:space="preserve"> </w:t>
+      </w:r>
+      <w:proofErr w:type="spellStart"/>
+      <w:proofErr w:type="gramStart"/>
+      <w:r>
+        <w:t>ja</w:t>
+      </w:r>
+      <w:proofErr w:type="spellEnd"/>
+      <w:proofErr w:type="gramEnd"/>
+      <w:r>
+        <w:t xml:space="preserve"> </w:t>
+      </w:r>
+      <w:proofErr w:type="spellStart"/>
+      <w:r>
+        <w:t>sakta</w:t>
+      </w:r>
+      <w:proofErr w:type="spellEnd"/>
+      <w:r>
+        <w:t xml:space="preserve"> </w:t>
+      </w:r>
+      <w:proofErr w:type="spellStart"/>
+      <w:r>
+        <w:t>hai</w:t>
+      </w:r>
+      <w:proofErr w:type="spellEnd"/>
+      <w:r>
+        <w:t>.</w:t>
+      </w:r>
+    </w:p>
+    <w:p>
+      <w:r>
+        <w:pict>
+          <v:rect id="_x0000_i1025" style="width:0;height:1.5pt" o:hralign="center" o:hrstd="t" o:hr="t" fillcolor="#a0a0a0" stroked="f"/>
+        </w:pict>
+      </w:r>
+    </w:p>
+    <w:p>
+      <w:pPr>
+        <w:pStyle w:val="Heading2"/>
+      </w:pPr>
+      <w:r>
+        <w:t>6. Functional Requirements</w:t>
+      </w:r>
+    </w:p>
+    <w:p>
+      <w:pPr>
+        <w:pStyle w:val="NormalWeb"/>
+      </w:pPr>
+      <w:r>
+        <w:t>The Student Management System shall provide the following functional requirements:</w:t>
+      </w:r>
+    </w:p>
+    <w:p>
+      <w:pPr>
+        <w:pStyle w:val="Heading3"/>
+        <w:rPr>
+          <w:rFonts w:ascii="Times New Roman" w:hAnsi="Times New Roman" w:cs="Times New Roman"/>
+          <w:b/>
+          <w:color w:val="auto"/>
+        </w:rPr>
+      </w:pPr>
+      <w:r>
+        <w:rPr>
+          <w:rFonts w:ascii="Times New Roman" w:hAnsi="Times New Roman" w:cs="Times New Roman"/>
+          <w:b/>
+          <w:color w:val="auto"/>
+        </w:rPr>
+        <w:t>6.1 Student Management</w:t>
+      </w:r>
+    </w:p>
+    <w:p>
+      <w:pPr>
+        <w:pStyle w:val="NormalWeb"/>
+      </w:pPr>
+      <w:r>
+        <w:t>The system shall allow the administrator to:</w:t>
+      </w:r>
+    </w:p>
+    <w:p>
+      <w:pPr>
+        <w:numPr>
+          <w:ilvl w:val="0"/>
+          <w:numId w:val="3"/>
+        </w:numPr>
+        <w:spacing w:before="100" w:beforeAutospacing="1" w:after="100" w:afterAutospacing="1" w:line="240" w:lineRule="auto"/>
+      </w:pPr>
+      <w:r>
+        <w:t xml:space="preserve">Add new student records. </w:t>
+      </w:r>
+    </w:p>
+    <w:p>
+      <w:pPr>
+        <w:numPr>
+          <w:ilvl w:val="0"/>
+          <w:numId w:val="3"/>
+        </w:numPr>
+        <w:spacing w:before="100" w:beforeAutospacing="1" w:after="100" w:afterAutospacing="1" w:line="240" w:lineRule="auto"/>
+      </w:pPr>
+      <w:r>
+        <w:t xml:space="preserve">View all student records. </w:t>
+      </w:r>
+    </w:p>
+    <w:p>
+      <w:pPr>
+        <w:numPr>
+          <w:ilvl w:val="0"/>
+          <w:numId w:val="3"/>
+        </w:numPr>
+        <w:spacing w:before="100" w:beforeAutospacing="1" w:after="100" w:afterAutospacing="1" w:line="240" w:lineRule="auto"/>
+      </w:pPr>
+      <w:r>
+        <w:t xml:space="preserve">Search students by name, student ID, or email. </w:t>
+      </w:r>
+    </w:p>
+    <w:p>
+      <w:pPr>
+        <w:numPr>
+          <w:ilvl w:val="0"/>
+          <w:numId w:val="3"/>
+        </w:numPr>
+        <w:spacing w:before="100" w:beforeAutospacing="1" w:after="100" w:afterAutospacing="1" w:line="240" w:lineRule="auto"/>
+      </w:pPr>
+      <w:r>
+        <w:t xml:space="preserve">Update existing student information. </w:t>
+      </w:r>
+    </w:p>
+    <w:p>
+      <w:pPr>
+        <w:numPr>
+          <w:ilvl w:val="0"/>
+          <w:numId w:val="3"/>
+        </w:numPr>
+        <w:spacing w:before="100" w:beforeAutospacing="1" w:after="100" w:afterAutospacing="1" w:line="240" w:lineRule="auto"/>
+      </w:pPr>
+      <w:r>
+        <w:t xml:space="preserve">Delete student records when required. </w:t>
+      </w:r>
+    </w:p>
+    <w:p>
+      <w:pPr>
+        <w:numPr>
+          <w:ilvl w:val="0"/>
+          <w:numId w:val="3"/>
+        </w:numPr>
+        <w:spacing w:before="100" w:beforeAutospacing="1" w:after="100" w:afterAutospacing="1" w:line="240" w:lineRule="auto"/>
+      </w:pPr>
+      <w:r>
+        <w:t xml:space="preserve">View detailed student information. </w:t>
+      </w:r>
+    </w:p>
+    <w:p>
+      <w:pPr>
+        <w:pStyle w:val="Heading3"/>
+        <w:rPr>
+          <w:rFonts w:ascii="Times New Roman" w:hAnsi="Times New Roman" w:cs="Times New Roman"/>
+          <w:b/>
+          <w:color w:val="auto"/>
+        </w:rPr>
+      </w:pPr>
+      <w:r>
+        <w:rPr>
+          <w:rFonts w:ascii="Times New Roman" w:hAnsi="Times New Roman" w:cs="Times New Roman"/>
+          <w:b/>
+          <w:color w:val="auto"/>
+        </w:rPr>
+        <w:t>6.2 Course Management</w:t>
+      </w:r>
+    </w:p>
+    <w:p>
+      <w:pPr>
+        <w:pStyle w:val="NormalWeb"/>
+      </w:pPr>
+      <w:r>
+        <w:t>The system shall allow the administrator to:</w:t>
+      </w:r>
+    </w:p>
+    <w:p>
+      <w:pPr>
+        <w:numPr>
+          <w:ilvl w:val="0"/>
+          <w:numId w:val="4"/>
+        </w:numPr>
+        <w:spacing w:before="100" w:beforeAutospacing="1" w:after="100" w:afterAutospacing="1" w:line="240" w:lineRule="auto"/>
+      </w:pPr>
+      <w:r>
+        <w:t xml:space="preserve">Add new courses. </w:t>
+      </w:r>
+    </w:p>
+    <w:p>
+      <w:pPr>
+        <w:numPr>
+          <w:ilvl w:val="0"/>
+          <w:numId w:val="4"/>
+        </w:numPr>
+        <w:spacing w:before="100" w:beforeAutospacing="1" w:after="100" w:afterAutospacing="1" w:line="240" w:lineRule="auto"/>
+      </w:pPr>
+      <w:r>
+        <w:t xml:space="preserve">View all available courses. </w:t>
+      </w:r>
+    </w:p>
+    <w:p>
+      <w:pPr>
+        <w:numPr>
+          <w:ilvl w:val="0"/>
+          <w:numId w:val="4"/>
+        </w:numPr>
+        <w:spacing w:before="100" w:beforeAutospacing="1" w:after="100" w:afterAutospacing="1" w:line="240" w:lineRule="auto"/>
+      </w:pPr>
+      <w:r>
+        <w:t xml:space="preserve">Search courses by course name or course code. </w:t>
+      </w:r>
+    </w:p>
+    <w:p>
+      <w:pPr>
+        <w:numPr>
+          <w:ilvl w:val="0"/>
+          <w:numId w:val="4"/>
+        </w:numPr>
+        <w:spacing w:before="100" w:beforeAutospacing="1" w:after="100" w:afterAutospacing="1" w:line="240" w:lineRule="auto"/>
+      </w:pPr>
+      <w:r>
+        <w:t xml:space="preserve">Update course information. </w:t>
+      </w:r>
+    </w:p>
+    <w:p>
+      <w:pPr>
+        <w:numPr>
+          <w:ilvl w:val="0"/>
+          <w:numId w:val="4"/>
+        </w:numPr>
+        <w:spacing w:before="100" w:beforeAutospacing="1" w:after="100" w:afterAutospacing="1" w:line="240" w:lineRule="auto"/>
+      </w:pPr>
+      <w:r>
+        <w:t xml:space="preserve">Delete courses when required. </w:t>
+      </w:r>
+    </w:p>
+    <w:p>
+      <w:pPr>
+        <w:numPr>
+          <w:ilvl w:val="0"/>
+          <w:numId w:val="4"/>
+        </w:numPr>
+        <w:spacing w:before="100" w:beforeAutospacing="1" w:after="100" w:afterAutospacing="1" w:line="240" w:lineRule="auto"/>
+      </w:pPr>
+      <w:r>
+        <w:t xml:space="preserve">Define course code, course title, and credit hours. </w:t>
+      </w:r>
+    </w:p>
+    <w:p>
+      <w:pPr>
+        <w:pStyle w:val="Heading3"/>
+        <w:rPr>
+          <w:rFonts w:ascii="Times New Roman" w:hAnsi="Times New Roman" w:cs="Times New Roman"/>
+          <w:b/>
+          <w:color w:val="auto"/>
+        </w:rPr>
+      </w:pPr>
+      <w:r>
+        <w:rPr>
+          <w:rFonts w:ascii="Times New Roman" w:hAnsi="Times New Roman" w:cs="Times New Roman"/>
+          <w:b/>
+          <w:color w:val="auto"/>
+        </w:rPr>
+        <w:t xml:space="preserve">6.3 Course </w:t>
+      </w:r>
+      <w:proofErr w:type="spellStart"/>
+      <w:r>
+        <w:rPr>
+          <w:rFonts w:ascii="Times New Roman" w:hAnsi="Times New Roman" w:cs="Times New Roman"/>
+          <w:b/>
+          <w:color w:val="auto"/>
+        </w:rPr>
+        <w:t>Enrollment</w:t>
+      </w:r>
+      <w:proofErr w:type="spellEnd"/>
+    </w:p>
+    <w:p>
+      <w:pPr>
+        <w:pStyle w:val="NormalWeb"/>
+      </w:pPr>
+      <w:r>
+        <w:t>The system shall allow the administrator to:</w:t>
+      </w:r>
+    </w:p>
+    <w:p>
+      <w:pPr>
+        <w:numPr>
+          <w:ilvl w:val="0"/>
+          <w:numId w:val="5"/>
+        </w:numPr>
+        <w:spacing w:before="100" w:beforeAutospacing="1" w:after="100" w:afterAutospacing="1" w:line="240" w:lineRule="auto"/>
+      </w:pPr>
+      <w:proofErr w:type="spellStart"/>
+      <w:r>
+        <w:t>Enroll</w:t>
+      </w:r>
+      <w:proofErr w:type="spellEnd"/>
+      <w:r>
+        <w:t xml:space="preserve"> a student in a course. </w:t>
+      </w:r>
+    </w:p>
+    <w:p>
+      <w:pPr>
+        <w:numPr>
+          <w:ilvl w:val="0"/>
+          <w:numId w:val="5"/>
+        </w:numPr>
+        <w:spacing w:before="100" w:beforeAutospacing="1" w:after="100" w:afterAutospacing="1" w:line="240" w:lineRule="auto"/>
+      </w:pPr>
+      <w:r>
+        <w:t xml:space="preserve">View all </w:t>
+      </w:r>
+      <w:proofErr w:type="spellStart"/>
+      <w:r>
+        <w:t>enrollment</w:t>
+      </w:r>
+      <w:proofErr w:type="spellEnd"/>
+      <w:r>
+        <w:t xml:space="preserve"> records. </w:t>
+      </w:r>
+    </w:p>
+    <w:p>
+      <w:pPr>
+        <w:numPr>
+          <w:ilvl w:val="0"/>
+          <w:numId w:val="5"/>
+        </w:numPr>
+        <w:spacing w:before="100" w:beforeAutospacing="1" w:after="100" w:afterAutospacing="1" w:line="240" w:lineRule="auto"/>
+      </w:pPr>
+      <w:r>
+        <w:t xml:space="preserve">View courses assigned to a specific student. </w:t>
+      </w:r>
+    </w:p>
+    <w:p>
+      <w:pPr>
+        <w:numPr>
+          <w:ilvl w:val="0"/>
+          <w:numId w:val="5"/>
+        </w:numPr>
+        <w:spacing w:before="100" w:beforeAutospacing="1" w:after="100" w:afterAutospacing="1" w:line="240" w:lineRule="auto"/>
+      </w:pPr>
+      <w:r>
+        <w:t xml:space="preserve">Prevent duplicate </w:t>
+      </w:r>
+      <w:proofErr w:type="spellStart"/>
+      <w:r>
+        <w:t>enrollment</w:t>
+      </w:r>
+      <w:proofErr w:type="spellEnd"/>
+      <w:r>
+        <w:t xml:space="preserve"> of the same student in the same course. </w:t>
+      </w:r>
+    </w:p>
+    <w:p>
+      <w:pPr>
+        <w:numPr>
+          <w:ilvl w:val="0"/>
+          <w:numId w:val="5"/>
+        </w:numPr>
+        <w:spacing w:before="100" w:beforeAutospacing="1" w:after="100" w:afterAutospacing="1" w:line="240" w:lineRule="auto"/>
+      </w:pPr>
+      <w:r>
+        <w:t xml:space="preserve">Remove an </w:t>
+      </w:r>
+      <w:proofErr w:type="spellStart"/>
+      <w:r>
+        <w:t>enrollment</w:t>
+      </w:r>
+      <w:proofErr w:type="spellEnd"/>
+      <w:r>
+        <w:t xml:space="preserve"> when required. </w:t>
+      </w:r>
+    </w:p>
+    <w:p>
+      <w:pPr>
+        <w:pStyle w:val="Heading3"/>
+        <w:rPr>
+          <w:rFonts w:ascii="Times New Roman" w:hAnsi="Times New Roman" w:cs="Times New Roman"/>
+          <w:b/>
+          <w:color w:val="auto"/>
+        </w:rPr>
+      </w:pPr>
+      <w:r>
+        <w:rPr>
+          <w:rFonts w:ascii="Times New Roman" w:hAnsi="Times New Roman" w:cs="Times New Roman"/>
+          <w:b/>
+          <w:color w:val="auto"/>
+        </w:rPr>
+        <w:t>6.4 Attendance Management</w:t>
+      </w:r>
+    </w:p>
+    <w:p>
+      <w:pPr>
+        <w:pStyle w:val="NormalWeb"/>
+      </w:pPr>
+      <w:r>
+        <w:t>The system shall allow the administrator to:</w:t>
+      </w:r>
+    </w:p>
+    <w:p>
+      <w:pPr>
+        <w:numPr>
+          <w:ilvl w:val="0"/>
+          <w:numId w:val="6"/>
+        </w:numPr>
+        <w:spacing w:before="100" w:beforeAutospacing="1" w:after="100" w:afterAutospacing="1" w:line="240" w:lineRule="auto"/>
+      </w:pPr>
+      <w:r>
+        <w:lastRenderedPageBreak/>
+        <w:t xml:space="preserve">Record attendance for enrolled students. </w:t>
+      </w:r>
+    </w:p>
+    <w:p>
+      <w:pPr>
+        <w:numPr>
+          <w:ilvl w:val="0"/>
+          <w:numId w:val="6"/>
+        </w:numPr>
+        <w:spacing w:before="100" w:beforeAutospacing="1" w:after="100" w:afterAutospacing="1" w:line="240" w:lineRule="auto"/>
+      </w:pPr>
+      <w:r>
+        <w:t xml:space="preserve">Select the attendance date. </w:t>
+      </w:r>
+    </w:p>
+    <w:p>
+      <w:pPr>
+        <w:numPr>
+          <w:ilvl w:val="0"/>
+          <w:numId w:val="6"/>
+        </w:numPr>
+        <w:spacing w:before="100" w:beforeAutospacing="1" w:after="100" w:afterAutospacing="1" w:line="240" w:lineRule="auto"/>
+      </w:pPr>
+      <w:r>
+        <w:t xml:space="preserve">Mark attendance as </w:t>
+      </w:r>
+      <w:r>
+        <w:rPr>
+          <w:rStyle w:val="Strong"/>
+        </w:rPr>
+        <w:t xml:space="preserve">Present, </w:t>
+      </w:r>
+      <w:proofErr w:type="gramStart"/>
+      <w:r>
+        <w:rPr>
+          <w:rStyle w:val="Strong"/>
+        </w:rPr>
+        <w:t>Absent</w:t>
+      </w:r>
+      <w:proofErr w:type="gramEnd"/>
+      <w:r>
+        <w:rPr>
+          <w:rStyle w:val="Strong"/>
+        </w:rPr>
+        <w:t>, or Excused</w:t>
+      </w:r>
+      <w:r>
+        <w:t xml:space="preserve">. </w:t>
+      </w:r>
+    </w:p>
+    <w:p>
+      <w:pPr>
+        <w:numPr>
+          <w:ilvl w:val="0"/>
+          <w:numId w:val="6"/>
+        </w:numPr>
+        <w:spacing w:before="100" w:beforeAutospacing="1" w:after="100" w:afterAutospacing="1" w:line="240" w:lineRule="auto"/>
+      </w:pPr>
+      <w:r>
+        <w:t xml:space="preserve">Add optional remarks for attendance records. </w:t>
+      </w:r>
+    </w:p>
+    <w:p>
+      <w:pPr>
+        <w:numPr>
+          <w:ilvl w:val="0"/>
+          <w:numId w:val="6"/>
+        </w:numPr>
+        <w:spacing w:before="100" w:beforeAutospacing="1" w:after="100" w:afterAutospacing="1" w:line="240" w:lineRule="auto"/>
+      </w:pPr>
+      <w:r>
+        <w:t xml:space="preserve">View attendance history. </w:t>
+      </w:r>
+    </w:p>
+    <w:p>
+      <w:pPr>
+        <w:numPr>
+          <w:ilvl w:val="0"/>
+          <w:numId w:val="6"/>
+        </w:numPr>
+        <w:spacing w:before="100" w:beforeAutospacing="1" w:after="100" w:afterAutospacing="1" w:line="240" w:lineRule="auto"/>
+      </w:pPr>
+      <w:r>
+        <w:t xml:space="preserve">Filter attendance records by student, course, date, or status. </w:t>
+      </w:r>
+    </w:p>
+    <w:p>
+      <w:pPr>
+        <w:numPr>
+          <w:ilvl w:val="0"/>
+          <w:numId w:val="6"/>
+        </w:numPr>
+        <w:spacing w:before="100" w:beforeAutospacing="1" w:after="100" w:afterAutospacing="1" w:line="240" w:lineRule="auto"/>
+      </w:pPr>
+      <w:r>
+        <w:t xml:space="preserve">Update or delete attendance records. </w:t>
+      </w:r>
+    </w:p>
+    <w:p>
+      <w:pPr>
+        <w:numPr>
+          <w:ilvl w:val="0"/>
+          <w:numId w:val="6"/>
+        </w:numPr>
+        <w:spacing w:before="100" w:beforeAutospacing="1" w:after="100" w:afterAutospacing="1" w:line="240" w:lineRule="auto"/>
+      </w:pPr>
+      <w:r>
+        <w:t xml:space="preserve">Prevent duplicate attendance records for the same student, course, and date. </w:t>
+      </w:r>
+    </w:p>
+    <w:p>
+      <w:pPr>
+        <w:pStyle w:val="Heading3"/>
+        <w:rPr>
+          <w:rFonts w:ascii="Times New Roman" w:hAnsi="Times New Roman" w:cs="Times New Roman"/>
+          <w:b/>
+          <w:color w:val="auto"/>
+        </w:rPr>
+      </w:pPr>
+      <w:r>
+        <w:rPr>
+          <w:rFonts w:ascii="Times New Roman" w:hAnsi="Times New Roman" w:cs="Times New Roman"/>
+          <w:b/>
+          <w:color w:val="auto"/>
+        </w:rPr>
+        <w:t>6.5 Grade Management</w:t>
+      </w:r>
+    </w:p>
+    <w:p>
+      <w:pPr>
+        <w:pStyle w:val="NormalWeb"/>
+      </w:pPr>
+      <w:r>
+        <w:t>The system shall allow the administrator to:</w:t>
+      </w:r>
+    </w:p>
+    <w:p>
+      <w:pPr>
+        <w:numPr>
+          <w:ilvl w:val="0"/>
+          <w:numId w:val="7"/>
+        </w:numPr>
+        <w:spacing w:before="100" w:beforeAutospacing="1" w:after="100" w:afterAutospacing="1" w:line="240" w:lineRule="auto"/>
+      </w:pPr>
+      <w:r>
+        <w:t xml:space="preserve">Add student grades for enrolled courses. </w:t>
+      </w:r>
+    </w:p>
+    <w:p>
+      <w:pPr>
+        <w:numPr>
+          <w:ilvl w:val="0"/>
+          <w:numId w:val="7"/>
+        </w:numPr>
+        <w:spacing w:before="100" w:beforeAutospacing="1" w:after="100" w:afterAutospacing="1" w:line="240" w:lineRule="auto"/>
+      </w:pPr>
+      <w:r>
+        <w:t xml:space="preserve">View grade records. </w:t>
+      </w:r>
+    </w:p>
+    <w:p>
+      <w:pPr>
+        <w:numPr>
+          <w:ilvl w:val="0"/>
+          <w:numId w:val="7"/>
+        </w:numPr>
+        <w:spacing w:before="100" w:beforeAutospacing="1" w:after="100" w:afterAutospacing="1" w:line="240" w:lineRule="auto"/>
+      </w:pPr>
+      <w:r>
+        <w:t xml:space="preserve">Update grade information. </w:t>
+      </w:r>
+    </w:p>
+    <w:p>
+      <w:pPr>
+        <w:numPr>
+          <w:ilvl w:val="0"/>
+          <w:numId w:val="7"/>
+        </w:numPr>
+        <w:spacing w:before="100" w:beforeAutospacing="1" w:after="100" w:afterAutospacing="1" w:line="240" w:lineRule="auto"/>
+      </w:pPr>
+      <w:r>
+        <w:t xml:space="preserve">Delete grade records when required. </w:t>
+      </w:r>
+    </w:p>
+    <w:p>
+      <w:pPr>
+        <w:numPr>
+          <w:ilvl w:val="0"/>
+          <w:numId w:val="7"/>
+        </w:numPr>
+        <w:spacing w:before="100" w:beforeAutospacing="1" w:after="100" w:afterAutospacing="1" w:line="240" w:lineRule="auto"/>
+      </w:pPr>
+      <w:r>
+        <w:t xml:space="preserve">Record marks and grade information. </w:t>
+      </w:r>
+    </w:p>
+    <w:p>
+      <w:pPr>
+        <w:numPr>
+          <w:ilvl w:val="0"/>
+          <w:numId w:val="7"/>
+        </w:numPr>
+        <w:spacing w:before="100" w:beforeAutospacing="1" w:after="100" w:afterAutospacing="1" w:line="240" w:lineRule="auto"/>
+      </w:pPr>
+      <w:r>
+        <w:t xml:space="preserve">View grades for a specific student or course. </w:t>
+      </w:r>
+    </w:p>
+    <w:p>
+      <w:pPr>
+        <w:pStyle w:val="Heading3"/>
+        <w:rPr>
+          <w:color w:val="auto"/>
+        </w:rPr>
+      </w:pPr>
+      <w:r>
+        <w:rPr>
+          <w:rFonts w:ascii="Times New Roman" w:hAnsi="Times New Roman" w:cs="Times New Roman"/>
+          <w:b/>
+          <w:color w:val="auto"/>
+        </w:rPr>
+        <w:t>6.6 Admin</w:t>
+      </w:r>
+      <w:r>
+        <w:rPr>
+          <w:color w:val="auto"/>
+        </w:rPr>
+        <w:t xml:space="preserve"> </w:t>
+      </w:r>
+      <w:r>
+        <w:rPr>
+          <w:rFonts w:ascii="Times New Roman" w:hAnsi="Times New Roman" w:cs="Times New Roman"/>
+          <w:b/>
+          <w:color w:val="auto"/>
+        </w:rPr>
+        <w:t>Dashboard</w:t>
+      </w:r>
+    </w:p>
+    <w:p>
+      <w:pPr>
+        <w:pStyle w:val="NormalWeb"/>
+      </w:pPr>
+      <w:r>
+        <w:t>The system shall provide an administrative dashboard that displays:</w:t>
+      </w:r>
+    </w:p>
+    <w:p>
+      <w:pPr>
+        <w:numPr>
+          <w:ilvl w:val="0"/>
+          <w:numId w:val="8"/>
+        </w:numPr>
+        <w:spacing w:before="100" w:beforeAutospacing="1" w:after="100" w:afterAutospacing="1" w:line="240" w:lineRule="auto"/>
+      </w:pPr>
+      <w:r>
+        <w:t xml:space="preserve">Total number of students. </w:t>
+      </w:r>
+    </w:p>
+    <w:p>
+      <w:pPr>
+        <w:numPr>
+          <w:ilvl w:val="0"/>
+          <w:numId w:val="8"/>
+        </w:numPr>
+        <w:spacing w:before="100" w:beforeAutospacing="1" w:after="100" w:afterAutospacing="1" w:line="240" w:lineRule="auto"/>
+      </w:pPr>
+      <w:r>
+        <w:t xml:space="preserve">Total number of courses. </w:t>
+      </w:r>
+    </w:p>
+    <w:p>
+      <w:pPr>
+        <w:numPr>
+          <w:ilvl w:val="0"/>
+          <w:numId w:val="8"/>
+        </w:numPr>
+        <w:spacing w:before="100" w:beforeAutospacing="1" w:after="100" w:afterAutospacing="1" w:line="240" w:lineRule="auto"/>
+      </w:pPr>
+      <w:r>
+        <w:t xml:space="preserve">Total number of </w:t>
+      </w:r>
+      <w:proofErr w:type="spellStart"/>
+      <w:r>
+        <w:t>enrollments</w:t>
+      </w:r>
+      <w:proofErr w:type="spellEnd"/>
+      <w:r>
+        <w:t xml:space="preserve">. </w:t>
+      </w:r>
+    </w:p>
+    <w:p>
+      <w:pPr>
+        <w:numPr>
+          <w:ilvl w:val="0"/>
+          <w:numId w:val="8"/>
+        </w:numPr>
+        <w:spacing w:before="100" w:beforeAutospacing="1" w:after="100" w:afterAutospacing="1" w:line="240" w:lineRule="auto"/>
+      </w:pPr>
+      <w:r>
+        <w:t xml:space="preserve">Total attendance records. </w:t>
+      </w:r>
+    </w:p>
+    <w:p>
+      <w:pPr>
+        <w:numPr>
+          <w:ilvl w:val="0"/>
+          <w:numId w:val="8"/>
+        </w:numPr>
+        <w:spacing w:before="100" w:beforeAutospacing="1" w:after="100" w:afterAutospacing="1" w:line="240" w:lineRule="auto"/>
+      </w:pPr>
+      <w:r>
+        <w:t xml:space="preserve">Present attendance count. </w:t>
+      </w:r>
+    </w:p>
+    <w:p>
+      <w:pPr>
+        <w:numPr>
+          <w:ilvl w:val="0"/>
+          <w:numId w:val="8"/>
+        </w:numPr>
+        <w:spacing w:before="100" w:beforeAutospacing="1" w:after="100" w:afterAutospacing="1" w:line="240" w:lineRule="auto"/>
+      </w:pPr>
+      <w:r>
+        <w:t xml:space="preserve">Absent attendance count. </w:t>
+      </w:r>
+    </w:p>
+    <w:p>
+      <w:pPr>
+        <w:numPr>
+          <w:ilvl w:val="0"/>
+          <w:numId w:val="8"/>
+        </w:numPr>
+        <w:spacing w:before="100" w:beforeAutospacing="1" w:after="100" w:afterAutospacing="1" w:line="240" w:lineRule="auto"/>
+      </w:pPr>
+      <w:r>
+        <w:t xml:space="preserve">Excused attendance count. </w:t>
+      </w:r>
+    </w:p>
+    <w:p>
+      <w:pPr>
+        <w:numPr>
+          <w:ilvl w:val="0"/>
+          <w:numId w:val="8"/>
+        </w:numPr>
+        <w:spacing w:before="100" w:beforeAutospacing="1" w:after="100" w:afterAutospacing="1" w:line="240" w:lineRule="auto"/>
+      </w:pPr>
+      <w:r>
+        <w:t xml:space="preserve">Recent student records. </w:t>
+      </w:r>
+    </w:p>
+    <w:p>
+      <w:pPr>
+        <w:pStyle w:val="Heading3"/>
+        <w:rPr>
+          <w:rFonts w:ascii="Times New Roman" w:hAnsi="Times New Roman" w:cs="Times New Roman"/>
+          <w:b/>
+          <w:color w:val="auto"/>
+        </w:rPr>
+      </w:pPr>
+      <w:r>
+        <w:rPr>
+          <w:rFonts w:ascii="Times New Roman" w:hAnsi="Times New Roman" w:cs="Times New Roman"/>
+          <w:b/>
+          <w:color w:val="auto"/>
+        </w:rPr>
+        <w:t>6.7 Report Generation</w:t>
+      </w:r>
+    </w:p>
+    <w:p>
+      <w:pPr>
+        <w:pStyle w:val="NormalWeb"/>
+      </w:pPr>
+      <w:r>
+        <w:t>The system shall allow the administrator to:</w:t>
+      </w:r>
+    </w:p>
+    <w:p>
+      <w:pPr>
+        <w:numPr>
+          <w:ilvl w:val="0"/>
+          <w:numId w:val="9"/>
+        </w:numPr>
+        <w:spacing w:before="100" w:beforeAutospacing="1" w:after="100" w:afterAutospacing="1" w:line="240" w:lineRule="auto"/>
+      </w:pPr>
+      <w:r>
+        <w:t xml:space="preserve">Generate student information reports. </w:t>
+      </w:r>
+    </w:p>
+    <w:p>
+      <w:pPr>
+        <w:numPr>
+          <w:ilvl w:val="0"/>
+          <w:numId w:val="9"/>
+        </w:numPr>
+        <w:spacing w:before="100" w:beforeAutospacing="1" w:after="100" w:afterAutospacing="1" w:line="240" w:lineRule="auto"/>
+      </w:pPr>
+      <w:r>
+        <w:t xml:space="preserve">Generate course </w:t>
+      </w:r>
+      <w:proofErr w:type="spellStart"/>
+      <w:r>
+        <w:t>enrollment</w:t>
+      </w:r>
+      <w:proofErr w:type="spellEnd"/>
+      <w:r>
+        <w:t xml:space="preserve"> reports. </w:t>
+      </w:r>
+    </w:p>
+    <w:p>
+      <w:pPr>
+        <w:numPr>
+          <w:ilvl w:val="0"/>
+          <w:numId w:val="9"/>
+        </w:numPr>
+        <w:spacing w:before="100" w:beforeAutospacing="1" w:after="100" w:afterAutospacing="1" w:line="240" w:lineRule="auto"/>
+      </w:pPr>
+      <w:r>
+        <w:t xml:space="preserve">Generate attendance reports. </w:t>
+      </w:r>
+    </w:p>
+    <w:p>
+      <w:pPr>
+        <w:numPr>
+          <w:ilvl w:val="0"/>
+          <w:numId w:val="9"/>
+        </w:numPr>
+        <w:spacing w:before="100" w:beforeAutospacing="1" w:after="100" w:afterAutospacing="1" w:line="240" w:lineRule="auto"/>
+      </w:pPr>
+      <w:r>
+        <w:t xml:space="preserve">Generate grade reports. </w:t>
+      </w:r>
+    </w:p>
+    <w:p>
+      <w:pPr>
+        <w:numPr>
+          <w:ilvl w:val="0"/>
+          <w:numId w:val="9"/>
+        </w:numPr>
+        <w:spacing w:before="100" w:beforeAutospacing="1" w:after="100" w:afterAutospacing="1" w:line="240" w:lineRule="auto"/>
+      </w:pPr>
+      <w:r>
+        <w:t xml:space="preserve">Filter reports by student, course, date, or attendance status. </w:t>
+      </w:r>
+    </w:p>
+    <w:p>
+      <w:pPr>
+        <w:numPr>
+          <w:ilvl w:val="0"/>
+          <w:numId w:val="9"/>
+        </w:numPr>
+        <w:spacing w:before="100" w:beforeAutospacing="1" w:after="100" w:afterAutospacing="1" w:line="240" w:lineRule="auto"/>
+      </w:pPr>
+      <w:r>
+        <w:t xml:space="preserve">View reports in a structured and readable format. </w:t>
+      </w:r>
+    </w:p>
+    <w:p>
+      <w:pPr>
+        <w:spacing w:after="0"/>
+      </w:pPr>
+      <w:r>
+        <w:pict>
+          <v:rect id="_x0000_i1026" style="width:0;height:1.5pt" o:hralign="center" o:hrstd="t" o:hr="t" fillcolor="#a0a0a0" stroked="f"/>
+        </w:pict>
+      </w:r>
+    </w:p>
+    <w:p>
+      <w:pPr>
+        <w:pStyle w:val="Heading2"/>
+      </w:pPr>
+    </w:p>
+    <w:p>
+      <w:pPr>
+        <w:pStyle w:val="Heading2"/>
+      </w:pPr>
+    </w:p>
+    <w:p>
+      <w:pPr>
+        <w:pStyle w:val="Heading2"/>
+      </w:pPr>
+      <w:r>
+        <w:lastRenderedPageBreak/>
+        <w:t>7. Non-Functional Requirements</w:t>
+      </w:r>
+    </w:p>
+    <w:p>
+      <w:pPr>
+        <w:pStyle w:val="Heading3"/>
+        <w:rPr>
+          <w:rFonts w:ascii="Times New Roman" w:hAnsi="Times New Roman" w:cs="Times New Roman"/>
+          <w:b/>
+          <w:color w:val="auto"/>
+        </w:rPr>
+      </w:pPr>
+      <w:r>
+        <w:rPr>
+          <w:rFonts w:ascii="Times New Roman" w:hAnsi="Times New Roman" w:cs="Times New Roman"/>
+          <w:b/>
+          <w:color w:val="auto"/>
+        </w:rPr>
+        <w:t>7.1 Usability</w:t>
+      </w:r>
+    </w:p>
+    <w:p>
+      <w:pPr>
+        <w:pStyle w:val="NormalWeb"/>
+      </w:pPr>
+      <w:r>
+        <w:t>The system shall provide a simple, clear, and user-friendly interface. The application shall be easy to navigate and should allow users to perform common tasks efficiently.</w:t>
+      </w:r>
+    </w:p>
+    <w:p>
+      <w:pPr>
+        <w:pStyle w:val="Heading3"/>
+        <w:rPr>
+          <w:rFonts w:ascii="Times New Roman" w:hAnsi="Times New Roman" w:cs="Times New Roman"/>
+          <w:b/>
+          <w:color w:val="auto"/>
+        </w:rPr>
+      </w:pPr>
+      <w:r>
+        <w:rPr>
+          <w:rFonts w:ascii="Times New Roman" w:hAnsi="Times New Roman" w:cs="Times New Roman"/>
+          <w:b/>
+          <w:color w:val="auto"/>
+        </w:rPr>
+        <w:t>7.2 Performance</w:t>
+      </w:r>
+    </w:p>
+    <w:p>
+      <w:pPr>
+        <w:pStyle w:val="NormalWeb"/>
+      </w:pPr>
+      <w:r>
+        <w:t xml:space="preserve">The system shall provide timely responses during normal usage. Student records, courses, </w:t>
+      </w:r>
+      <w:proofErr w:type="spellStart"/>
+      <w:r>
+        <w:t>enrollments</w:t>
+      </w:r>
+      <w:proofErr w:type="spellEnd"/>
+      <w:r>
+        <w:t>, attendance, grades, and reports should load efficiently.</w:t>
+      </w:r>
+    </w:p>
+    <w:p>
+      <w:pPr>
+        <w:pStyle w:val="Heading3"/>
+        <w:rPr>
+          <w:rFonts w:ascii="Times New Roman" w:hAnsi="Times New Roman" w:cs="Times New Roman"/>
+          <w:b/>
+          <w:color w:val="auto"/>
+        </w:rPr>
+      </w:pPr>
+      <w:r>
+        <w:rPr>
+          <w:rFonts w:ascii="Times New Roman" w:hAnsi="Times New Roman" w:cs="Times New Roman"/>
+          <w:b/>
+          <w:color w:val="auto"/>
+        </w:rPr>
+        <w:t>7.3 Security</w:t>
+      </w:r>
+    </w:p>
+    <w:p>
+      <w:pPr>
+        <w:pStyle w:val="NormalWeb"/>
+      </w:pPr>
+      <w:r>
+        <w:t>The system shall validate user input and protect the application from invalid or unauthorized data access. Sensitive system operations shall be restricted to authorized administrators.</w:t>
+      </w:r>
+    </w:p>
+    <w:p>
+      <w:pPr>
+        <w:pStyle w:val="Heading3"/>
+        <w:rPr>
+          <w:rFonts w:ascii="Times New Roman" w:hAnsi="Times New Roman" w:cs="Times New Roman"/>
+          <w:b/>
+          <w:color w:val="auto"/>
+        </w:rPr>
+      </w:pPr>
+      <w:r>
+        <w:rPr>
+          <w:rFonts w:ascii="Times New Roman" w:hAnsi="Times New Roman" w:cs="Times New Roman"/>
+          <w:b/>
+          <w:color w:val="auto"/>
+        </w:rPr>
+        <w:t>7.4 Reliability</w:t>
+      </w:r>
+    </w:p>
+    <w:p>
+      <w:pPr>
+        <w:pStyle w:val="NormalWeb"/>
+      </w:pPr>
+      <w:r>
+        <w:t>The system shall maintain accurate and consistent records. Database relationships and validation rules shall help prevent duplicate or invalid data.</w:t>
+      </w:r>
+    </w:p>
+    <w:p>
+      <w:pPr>
+        <w:pStyle w:val="Heading3"/>
+        <w:rPr>
+          <w:b/>
+          <w:color w:val="auto"/>
+        </w:rPr>
+      </w:pPr>
+      <w:r>
+        <w:rPr>
+          <w:rFonts w:ascii="Times New Roman" w:hAnsi="Times New Roman" w:cs="Times New Roman"/>
+          <w:b/>
+          <w:color w:val="auto"/>
+        </w:rPr>
+        <w:t>7.5 Availability</w:t>
+      </w:r>
+    </w:p>
+    <w:p>
+      <w:pPr>
+        <w:pStyle w:val="NormalWeb"/>
+      </w:pPr>
+      <w:r>
+        <w:t>The system shall be available whenever the application and database services are running correctly.</w:t>
+      </w:r>
+    </w:p>
+    <w:p>
+      <w:pPr>
+        <w:pStyle w:val="Heading3"/>
+        <w:rPr>
+          <w:rFonts w:ascii="Times New Roman" w:hAnsi="Times New Roman" w:cs="Times New Roman"/>
+          <w:b/>
+          <w:color w:val="auto"/>
+        </w:rPr>
+      </w:pPr>
+      <w:r>
+        <w:rPr>
+          <w:rFonts w:ascii="Times New Roman" w:hAnsi="Times New Roman" w:cs="Times New Roman"/>
+          <w:b/>
+          <w:color w:val="auto"/>
+        </w:rPr>
+        <w:t>7.6 Maintainability</w:t>
+      </w:r>
+    </w:p>
+    <w:p>
+      <w:pPr>
+        <w:pStyle w:val="NormalWeb"/>
+      </w:pPr>
+      <w:r>
+        <w:t xml:space="preserve">The system shall use a modular and organized code structure so that future updates and maintenance </w:t>
+      </w:r>
+      <w:proofErr w:type="gramStart"/>
+      <w:r>
+        <w:t>can be performed</w:t>
+      </w:r>
+      <w:proofErr w:type="gramEnd"/>
+      <w:r>
+        <w:t xml:space="preserve"> efficiently.</w:t>
+      </w:r>
+    </w:p>
+    <w:p>
+      <w:pPr>
+        <w:pStyle w:val="Heading3"/>
+        <w:rPr>
+          <w:rFonts w:ascii="Times New Roman" w:hAnsi="Times New Roman" w:cs="Times New Roman"/>
+          <w:b/>
+          <w:color w:val="auto"/>
+        </w:rPr>
+      </w:pPr>
+      <w:r>
+        <w:rPr>
+          <w:rFonts w:ascii="Times New Roman" w:hAnsi="Times New Roman" w:cs="Times New Roman"/>
+          <w:b/>
+          <w:color w:val="auto"/>
+        </w:rPr>
+        <w:t>7.7 Compatibility</w:t>
+      </w:r>
+    </w:p>
+    <w:p>
+      <w:pPr>
+        <w:pStyle w:val="NormalWeb"/>
+      </w:pPr>
+      <w:r>
+        <w:t>The system shall be compatible with modern desktop and mobile web browsers.</w:t>
+      </w:r>
+    </w:p>
+    <w:p>
+      <w:pPr>
+        <w:pStyle w:val="Heading3"/>
+        <w:rPr>
+          <w:rFonts w:ascii="Times New Roman" w:hAnsi="Times New Roman" w:cs="Times New Roman"/>
+          <w:b/>
+          <w:color w:val="auto"/>
+        </w:rPr>
+      </w:pPr>
+      <w:r>
+        <w:rPr>
+          <w:rFonts w:ascii="Times New Roman" w:hAnsi="Times New Roman" w:cs="Times New Roman"/>
+          <w:b/>
+          <w:color w:val="auto"/>
+        </w:rPr>
+        <w:t>7.8 Scalability</w:t>
+      </w:r>
+    </w:p>
+    <w:p>
+      <w:pPr>
+        <w:pStyle w:val="NormalWeb"/>
+      </w:pPr>
+      <w:r>
+        <w:t xml:space="preserve">The system design shall allow additional modules and users to </w:t>
+      </w:r>
+      <w:proofErr w:type="gramStart"/>
+      <w:r>
+        <w:t>be added</w:t>
+      </w:r>
+      <w:proofErr w:type="gramEnd"/>
+      <w:r>
+        <w:t xml:space="preserve"> in future versions.</w:t>
+      </w:r>
+    </w:p>
+    <w:p>
+      <w:r>
+        <w:pict>
+          <v:rect id="_x0000_i1027" style="width:0;height:1.5pt" o:hralign="center" o:hrstd="t" o:hr="t" fillcolor="#a0a0a0" stroked="f"/>
+        </w:pict>
+      </w:r>
+    </w:p>
+    <w:p>
+      <w:pPr>
+        <w:pStyle w:val="Heading2"/>
+      </w:pPr>
+      <w:r>
+        <w:t>8. System Modules</w:t>
+      </w:r>
+    </w:p>
+    <w:p>
+      <w:pPr>
+        <w:pStyle w:val="NormalWeb"/>
+      </w:pPr>
+      <w:r>
+        <w:t>The Student Management System will consist of the following main modules:</w:t>
+      </w:r>
+    </w:p>
+    <w:p>
+      <w:pPr>
+        <w:numPr>
+          <w:ilvl w:val="0"/>
+          <w:numId w:val="10"/>
+        </w:numPr>
+        <w:spacing w:before="100" w:beforeAutospacing="1" w:after="100" w:afterAutospacing="1" w:line="240" w:lineRule="auto"/>
+      </w:pPr>
+      <w:r>
+        <w:rPr>
+          <w:rStyle w:val="Strong"/>
+        </w:rPr>
+        <w:t>Admin Dashboard</w:t>
+      </w:r>
+      <w:r>
+        <w:t xml:space="preserve"> </w:t>
+      </w:r>
+    </w:p>
+    <w:p>
+      <w:pPr>
+        <w:numPr>
+          <w:ilvl w:val="0"/>
+          <w:numId w:val="10"/>
+        </w:numPr>
+        <w:spacing w:before="100" w:beforeAutospacing="1" w:after="100" w:afterAutospacing="1" w:line="240" w:lineRule="auto"/>
+      </w:pPr>
+      <w:r>
+        <w:rPr>
+          <w:rStyle w:val="Strong"/>
+        </w:rPr>
+        <w:t>Student Management</w:t>
+      </w:r>
+      <w:r>
+        <w:t xml:space="preserve"> </w:t>
+      </w:r>
+    </w:p>
+    <w:p>
+      <w:pPr>
+        <w:numPr>
+          <w:ilvl w:val="0"/>
+          <w:numId w:val="10"/>
+        </w:numPr>
+        <w:spacing w:before="100" w:beforeAutospacing="1" w:after="100" w:afterAutospacing="1" w:line="240" w:lineRule="auto"/>
+      </w:pPr>
+      <w:r>
+        <w:rPr>
+          <w:rStyle w:val="Strong"/>
+        </w:rPr>
+        <w:lastRenderedPageBreak/>
+        <w:t>Course Management</w:t>
+      </w:r>
+      <w:r>
+        <w:t xml:space="preserve"> </w:t>
+      </w:r>
+    </w:p>
+    <w:p>
+      <w:pPr>
+        <w:numPr>
+          <w:ilvl w:val="0"/>
+          <w:numId w:val="10"/>
+        </w:numPr>
+        <w:spacing w:before="100" w:beforeAutospacing="1" w:after="100" w:afterAutospacing="1" w:line="240" w:lineRule="auto"/>
+      </w:pPr>
+      <w:r>
+        <w:rPr>
+          <w:rStyle w:val="Strong"/>
+        </w:rPr>
+        <w:t xml:space="preserve">Course </w:t>
+      </w:r>
+      <w:proofErr w:type="spellStart"/>
+      <w:r>
+        <w:rPr>
+          <w:rStyle w:val="Strong"/>
+        </w:rPr>
+        <w:t>Enrollment</w:t>
+      </w:r>
+      <w:proofErr w:type="spellEnd"/>
+      <w:r>
+        <w:t xml:space="preserve"> </w:t>
+      </w:r>
+    </w:p>
+    <w:p>
+      <w:pPr>
+        <w:numPr>
+          <w:ilvl w:val="0"/>
+          <w:numId w:val="10"/>
+        </w:numPr>
+        <w:spacing w:before="100" w:beforeAutospacing="1" w:after="100" w:afterAutospacing="1" w:line="240" w:lineRule="auto"/>
+      </w:pPr>
+      <w:r>
+        <w:rPr>
+          <w:rStyle w:val="Strong"/>
+        </w:rPr>
+        <w:t>Attendance Management</w:t>
+      </w:r>
+      <w:r>
+        <w:t xml:space="preserve"> </w:t>
+      </w:r>
+    </w:p>
+    <w:p>
+      <w:pPr>
+        <w:numPr>
+          <w:ilvl w:val="0"/>
+          <w:numId w:val="10"/>
+        </w:numPr>
+        <w:spacing w:before="100" w:beforeAutospacing="1" w:after="100" w:afterAutospacing="1" w:line="240" w:lineRule="auto"/>
+      </w:pPr>
+      <w:r>
+        <w:rPr>
+          <w:rStyle w:val="Strong"/>
+        </w:rPr>
+        <w:t>Grade Management</w:t>
+      </w:r>
+      <w:r>
+        <w:t xml:space="preserve"> </w:t>
+      </w:r>
+    </w:p>
+    <w:p>
+      <w:pPr>
+        <w:numPr>
+          <w:ilvl w:val="0"/>
+          <w:numId w:val="10"/>
+        </w:numPr>
+        <w:spacing w:before="100" w:beforeAutospacing="1" w:after="100" w:afterAutospacing="1" w:line="240" w:lineRule="auto"/>
+      </w:pPr>
+      <w:r>
+        <w:rPr>
+          <w:rStyle w:val="Strong"/>
+        </w:rPr>
+        <w:t>Report Generation</w:t>
+      </w:r>
+    </w:p>
+    <w:p>
+      <w:bookmarkStart w:id="0" w:name="_GoBack"/>
+      <w:bookmarkEnd w:id="0"/>
+    </w:p>
     <w:sectPr>
       <w:pgSz w:w="11906" w:h="16838"/>
       <w:pgMar w:top="1440" w:right="1440" w:bottom="1440" w:left="1440" w:header="708" w:footer="708" w:gutter="0"/>
@@ -447,6 +2012,155 @@
 <file path=word/numbering.xml><?xml version="1.0" encoding="utf-8"?>
 <w:numbering xmlns:wpc="http://schemas.microsoft.com/office/word/2010/wordprocessingCanvas" xmlns:cx="http://schemas.microsoft.com/office/drawing/2014/chartex" xmlns:cx1="http://schemas.microsoft.com/office/drawing/2015/9/8/chartex" xmlns:mc="http://schemas.openxmlformats.org/markup-compatibility/2006" xmlns:o="urn:schemas-microsoft-com:office:office" xmlns:r="http://schemas.openxmlformats.org/officeDocument/2006/relationships" xmlns:m="http://schemas.openxmlformats.org/officeDocument/2006/math" xmlns:v="urn:schemas-microsoft-com:vml" xmlns:wp14="http://schemas.microsoft.com/office/word/2010/wordprocessingDrawing" xmlns:wp="http://schemas.openxmlformats.org/drawingml/2006/wordprocessingDrawing" xmlns:w10="urn:schemas-microsoft-com:office:word" xmlns:w="http://schemas.openxmlformats.org/wordprocessingml/2006/main" xmlns:w14="http://schemas.microsoft.com/office/word/2010/wordml" xmlns:w15="http://schemas.microsoft.com/office/word/2012/wordml" xmlns:w16se="http://schemas.microsoft.com/office/word/2015/wordml/symex" xmlns:wpg="http://schemas.microsoft.com/office/word/2010/wordprocessingGroup" xmlns:wpi="http://schemas.microsoft.com/office/word/2010/wordprocessingInk" xmlns:wne="http://schemas.microsoft.com/office/word/2006/wordml" xmlns:wps="http://schemas.microsoft.com/office/word/2010/wordprocessingShape" mc:Ignorable="w14 w15 w16se wp14">
   <w:abstractNum w:abstractNumId="0" w15:restartNumberingAfterBreak="0">
+    <w:nsid w:val="07FE5963"/>
+    <w:multiLevelType w:val="multilevel"/>
+    <w:tmpl w:val="05D61FA8"/>
+    <w:lvl w:ilvl="0">
+      <w:start w:val="1"/>
+      <w:numFmt w:val="bullet"/>
+      <w:lvlText w:val=""/>
+      <w:lvlJc w:val="left"/>
+      <w:pPr>
+        <w:tabs>
+          <w:tab w:val="num" w:pos="720"/>
+        </w:tabs>
+        <w:ind w:left="720" w:hanging="360"/>
+      </w:pPr>
+      <w:rPr>
+        <w:rFonts w:ascii="Symbol" w:hAnsi="Symbol" w:hint="default"/>
+        <w:sz w:val="20"/>
+      </w:rPr>
+    </w:lvl>
+    <w:lvl w:ilvl="1" w:tentative="1">
+      <w:start w:val="1"/>
+      <w:numFmt w:val="bullet"/>
+      <w:lvlText w:val="o"/>
+      <w:lvlJc w:val="left"/>
+      <w:pPr>
+        <w:tabs>
+          <w:tab w:val="num" w:pos="1440"/>
+        </w:tabs>
+        <w:ind w:left="1440" w:hanging="360"/>
+      </w:pPr>
+      <w:rPr>
+        <w:rFonts w:ascii="Courier New" w:hAnsi="Courier New" w:hint="default"/>
+        <w:sz w:val="20"/>
+      </w:rPr>
+    </w:lvl>
+    <w:lvl w:ilvl="2" w:tentative="1">
+      <w:start w:val="1"/>
+      <w:numFmt w:val="bullet"/>
+      <w:lvlText w:val=""/>
+      <w:lvlJc w:val="left"/>
+      <w:pPr>
+        <w:tabs>
+          <w:tab w:val="num" w:pos="2160"/>
+        </w:tabs>
+        <w:ind w:left="2160" w:hanging="360"/>
+      </w:pPr>
+      <w:rPr>
+        <w:rFonts w:ascii="Wingdings" w:hAnsi="Wingdings" w:hint="default"/>
+        <w:sz w:val="20"/>
+      </w:rPr>
+    </w:lvl>
+    <w:lvl w:ilvl="3" w:tentative="1">
+      <w:start w:val="1"/>
+      <w:numFmt w:val="bullet"/>
+      <w:lvlText w:val=""/>
+      <w:lvlJc w:val="left"/>
+      <w:pPr>
+        <w:tabs>
+          <w:tab w:val="num" w:pos="2880"/>
+        </w:tabs>
+        <w:ind w:left="2880" w:hanging="360"/>
+      </w:pPr>
+      <w:rPr>
+        <w:rFonts w:ascii="Wingdings" w:hAnsi="Wingdings" w:hint="default"/>
+        <w:sz w:val="20"/>
+      </w:rPr>
+    </w:lvl>
+    <w:lvl w:ilvl="4" w:tentative="1">
+      <w:start w:val="1"/>
+      <w:numFmt w:val="bullet"/>
+      <w:lvlText w:val=""/>
+      <w:lvlJc w:val="left"/>
+      <w:pPr>
+        <w:tabs>
+          <w:tab w:val="num" w:pos="3600"/>
+        </w:tabs>
+        <w:ind w:left="3600" w:hanging="360"/>
+      </w:pPr>
+      <w:rPr>
+        <w:rFonts w:ascii="Wingdings" w:hAnsi="Wingdings" w:hint="default"/>
+        <w:sz w:val="20"/>
+      </w:rPr>
+    </w:lvl>
+    <w:lvl w:ilvl="5" w:tentative="1">
+      <w:start w:val="1"/>
+      <w:numFmt w:val="bullet"/>
+      <w:lvlText w:val=""/>
+      <w:lvlJc w:val="left"/>
+      <w:pPr>
+        <w:tabs>
+          <w:tab w:val="num" w:pos="4320"/>
+        </w:tabs>
+        <w:ind w:left="4320" w:hanging="360"/>
+      </w:pPr>
+      <w:rPr>
+        <w:rFonts w:ascii="Wingdings" w:hAnsi="Wingdings" w:hint="default"/>
+        <w:sz w:val="20"/>
+      </w:rPr>
+    </w:lvl>
+    <w:lvl w:ilvl="6" w:tentative="1">
+      <w:start w:val="1"/>
+      <w:numFmt w:val="bullet"/>
+      <w:lvlText w:val=""/>
+      <w:lvlJc w:val="left"/>
+      <w:pPr>
+        <w:tabs>
+          <w:tab w:val="num" w:pos="5040"/>
+        </w:tabs>
+        <w:ind w:left="5040" w:hanging="360"/>
+      </w:pPr>
+      <w:rPr>
+        <w:rFonts w:ascii="Wingdings" w:hAnsi="Wingdings" w:hint="default"/>
+        <w:sz w:val="20"/>
+      </w:rPr>
+    </w:lvl>
+    <w:lvl w:ilvl="7" w:tentative="1">
+      <w:start w:val="1"/>
+      <w:numFmt w:val="bullet"/>
+      <w:lvlText w:val=""/>
+      <w:lvlJc w:val="left"/>
+      <w:pPr>
+        <w:tabs>
+          <w:tab w:val="num" w:pos="5760"/>
+        </w:tabs>
+        <w:ind w:left="5760" w:hanging="360"/>
+      </w:pPr>
+      <w:rPr>
+        <w:rFonts w:ascii="Wingdings" w:hAnsi="Wingdings" w:hint="default"/>
+        <w:sz w:val="20"/>
+      </w:rPr>
+    </w:lvl>
+    <w:lvl w:ilvl="8" w:tentative="1">
+      <w:start w:val="1"/>
+      <w:numFmt w:val="bullet"/>
+      <w:lvlText w:val=""/>
+      <w:lvlJc w:val="left"/>
+      <w:pPr>
+        <w:tabs>
+          <w:tab w:val="num" w:pos="6480"/>
+        </w:tabs>
+        <w:ind w:left="6480" w:hanging="360"/>
+      </w:pPr>
+      <w:rPr>
+        <w:rFonts w:ascii="Wingdings" w:hAnsi="Wingdings" w:hint="default"/>
+        <w:sz w:val="20"/>
+      </w:rPr>
+    </w:lvl>
+  </w:abstractNum>
+  <w:abstractNum w:abstractNumId="1" w15:restartNumberingAfterBreak="0">
     <w:nsid w:val="2DAC5E21"/>
     <w:multiLevelType w:val="multilevel"/>
     <w:tmpl w:val="CC02F900"/>
@@ -595,8 +2309,1191 @@
       </w:rPr>
     </w:lvl>
   </w:abstractNum>
+  <w:abstractNum w:abstractNumId="2" w15:restartNumberingAfterBreak="0">
+    <w:nsid w:val="347C3760"/>
+    <w:multiLevelType w:val="multilevel"/>
+    <w:tmpl w:val="2B6672E4"/>
+    <w:lvl w:ilvl="0">
+      <w:start w:val="1"/>
+      <w:numFmt w:val="bullet"/>
+      <w:lvlText w:val=""/>
+      <w:lvlJc w:val="left"/>
+      <w:pPr>
+        <w:tabs>
+          <w:tab w:val="num" w:pos="720"/>
+        </w:tabs>
+        <w:ind w:left="720" w:hanging="360"/>
+      </w:pPr>
+      <w:rPr>
+        <w:rFonts w:ascii="Symbol" w:hAnsi="Symbol" w:hint="default"/>
+        <w:sz w:val="20"/>
+      </w:rPr>
+    </w:lvl>
+    <w:lvl w:ilvl="1" w:tentative="1">
+      <w:start w:val="1"/>
+      <w:numFmt w:val="bullet"/>
+      <w:lvlText w:val="o"/>
+      <w:lvlJc w:val="left"/>
+      <w:pPr>
+        <w:tabs>
+          <w:tab w:val="num" w:pos="1440"/>
+        </w:tabs>
+        <w:ind w:left="1440" w:hanging="360"/>
+      </w:pPr>
+      <w:rPr>
+        <w:rFonts w:ascii="Courier New" w:hAnsi="Courier New" w:hint="default"/>
+        <w:sz w:val="20"/>
+      </w:rPr>
+    </w:lvl>
+    <w:lvl w:ilvl="2" w:tentative="1">
+      <w:start w:val="1"/>
+      <w:numFmt w:val="bullet"/>
+      <w:lvlText w:val=""/>
+      <w:lvlJc w:val="left"/>
+      <w:pPr>
+        <w:tabs>
+          <w:tab w:val="num" w:pos="2160"/>
+        </w:tabs>
+        <w:ind w:left="2160" w:hanging="360"/>
+      </w:pPr>
+      <w:rPr>
+        <w:rFonts w:ascii="Wingdings" w:hAnsi="Wingdings" w:hint="default"/>
+        <w:sz w:val="20"/>
+      </w:rPr>
+    </w:lvl>
+    <w:lvl w:ilvl="3" w:tentative="1">
+      <w:start w:val="1"/>
+      <w:numFmt w:val="bullet"/>
+      <w:lvlText w:val=""/>
+      <w:lvlJc w:val="left"/>
+      <w:pPr>
+        <w:tabs>
+          <w:tab w:val="num" w:pos="2880"/>
+        </w:tabs>
+        <w:ind w:left="2880" w:hanging="360"/>
+      </w:pPr>
+      <w:rPr>
+        <w:rFonts w:ascii="Wingdings" w:hAnsi="Wingdings" w:hint="default"/>
+        <w:sz w:val="20"/>
+      </w:rPr>
+    </w:lvl>
+    <w:lvl w:ilvl="4" w:tentative="1">
+      <w:start w:val="1"/>
+      <w:numFmt w:val="bullet"/>
+      <w:lvlText w:val=""/>
+      <w:lvlJc w:val="left"/>
+      <w:pPr>
+        <w:tabs>
+          <w:tab w:val="num" w:pos="3600"/>
+        </w:tabs>
+        <w:ind w:left="3600" w:hanging="360"/>
+      </w:pPr>
+      <w:rPr>
+        <w:rFonts w:ascii="Wingdings" w:hAnsi="Wingdings" w:hint="default"/>
+        <w:sz w:val="20"/>
+      </w:rPr>
+    </w:lvl>
+    <w:lvl w:ilvl="5" w:tentative="1">
+      <w:start w:val="1"/>
+      <w:numFmt w:val="bullet"/>
+      <w:lvlText w:val=""/>
+      <w:lvlJc w:val="left"/>
+      <w:pPr>
+        <w:tabs>
+          <w:tab w:val="num" w:pos="4320"/>
+        </w:tabs>
+        <w:ind w:left="4320" w:hanging="360"/>
+      </w:pPr>
+      <w:rPr>
+        <w:rFonts w:ascii="Wingdings" w:hAnsi="Wingdings" w:hint="default"/>
+        <w:sz w:val="20"/>
+      </w:rPr>
+    </w:lvl>
+    <w:lvl w:ilvl="6" w:tentative="1">
+      <w:start w:val="1"/>
+      <w:numFmt w:val="bullet"/>
+      <w:lvlText w:val=""/>
+      <w:lvlJc w:val="left"/>
+      <w:pPr>
+        <w:tabs>
+          <w:tab w:val="num" w:pos="5040"/>
+        </w:tabs>
+        <w:ind w:left="5040" w:hanging="360"/>
+      </w:pPr>
+      <w:rPr>
+        <w:rFonts w:ascii="Wingdings" w:hAnsi="Wingdings" w:hint="default"/>
+        <w:sz w:val="20"/>
+      </w:rPr>
+    </w:lvl>
+    <w:lvl w:ilvl="7" w:tentative="1">
+      <w:start w:val="1"/>
+      <w:numFmt w:val="bullet"/>
+      <w:lvlText w:val=""/>
+      <w:lvlJc w:val="left"/>
+      <w:pPr>
+        <w:tabs>
+          <w:tab w:val="num" w:pos="5760"/>
+        </w:tabs>
+        <w:ind w:left="5760" w:hanging="360"/>
+      </w:pPr>
+      <w:rPr>
+        <w:rFonts w:ascii="Wingdings" w:hAnsi="Wingdings" w:hint="default"/>
+        <w:sz w:val="20"/>
+      </w:rPr>
+    </w:lvl>
+    <w:lvl w:ilvl="8" w:tentative="1">
+      <w:start w:val="1"/>
+      <w:numFmt w:val="bullet"/>
+      <w:lvlText w:val=""/>
+      <w:lvlJc w:val="left"/>
+      <w:pPr>
+        <w:tabs>
+          <w:tab w:val="num" w:pos="6480"/>
+        </w:tabs>
+        <w:ind w:left="6480" w:hanging="360"/>
+      </w:pPr>
+      <w:rPr>
+        <w:rFonts w:ascii="Wingdings" w:hAnsi="Wingdings" w:hint="default"/>
+        <w:sz w:val="20"/>
+      </w:rPr>
+    </w:lvl>
+  </w:abstractNum>
+  <w:abstractNum w:abstractNumId="3" w15:restartNumberingAfterBreak="0">
+    <w:nsid w:val="348766F3"/>
+    <w:multiLevelType w:val="multilevel"/>
+    <w:tmpl w:val="9168C43A"/>
+    <w:lvl w:ilvl="0">
+      <w:start w:val="1"/>
+      <w:numFmt w:val="bullet"/>
+      <w:lvlText w:val=""/>
+      <w:lvlJc w:val="left"/>
+      <w:pPr>
+        <w:tabs>
+          <w:tab w:val="num" w:pos="720"/>
+        </w:tabs>
+        <w:ind w:left="720" w:hanging="360"/>
+      </w:pPr>
+      <w:rPr>
+        <w:rFonts w:ascii="Symbol" w:hAnsi="Symbol" w:hint="default"/>
+        <w:sz w:val="20"/>
+      </w:rPr>
+    </w:lvl>
+    <w:lvl w:ilvl="1" w:tentative="1">
+      <w:start w:val="1"/>
+      <w:numFmt w:val="bullet"/>
+      <w:lvlText w:val="o"/>
+      <w:lvlJc w:val="left"/>
+      <w:pPr>
+        <w:tabs>
+          <w:tab w:val="num" w:pos="1440"/>
+        </w:tabs>
+        <w:ind w:left="1440" w:hanging="360"/>
+      </w:pPr>
+      <w:rPr>
+        <w:rFonts w:ascii="Courier New" w:hAnsi="Courier New" w:hint="default"/>
+        <w:sz w:val="20"/>
+      </w:rPr>
+    </w:lvl>
+    <w:lvl w:ilvl="2" w:tentative="1">
+      <w:start w:val="1"/>
+      <w:numFmt w:val="bullet"/>
+      <w:lvlText w:val=""/>
+      <w:lvlJc w:val="left"/>
+      <w:pPr>
+        <w:tabs>
+          <w:tab w:val="num" w:pos="2160"/>
+        </w:tabs>
+        <w:ind w:left="2160" w:hanging="360"/>
+      </w:pPr>
+      <w:rPr>
+        <w:rFonts w:ascii="Wingdings" w:hAnsi="Wingdings" w:hint="default"/>
+        <w:sz w:val="20"/>
+      </w:rPr>
+    </w:lvl>
+    <w:lvl w:ilvl="3" w:tentative="1">
+      <w:start w:val="1"/>
+      <w:numFmt w:val="bullet"/>
+      <w:lvlText w:val=""/>
+      <w:lvlJc w:val="left"/>
+      <w:pPr>
+        <w:tabs>
+          <w:tab w:val="num" w:pos="2880"/>
+        </w:tabs>
+        <w:ind w:left="2880" w:hanging="360"/>
+      </w:pPr>
+      <w:rPr>
+        <w:rFonts w:ascii="Wingdings" w:hAnsi="Wingdings" w:hint="default"/>
+        <w:sz w:val="20"/>
+      </w:rPr>
+    </w:lvl>
+    <w:lvl w:ilvl="4" w:tentative="1">
+      <w:start w:val="1"/>
+      <w:numFmt w:val="bullet"/>
+      <w:lvlText w:val=""/>
+      <w:lvlJc w:val="left"/>
+      <w:pPr>
+        <w:tabs>
+          <w:tab w:val="num" w:pos="3600"/>
+        </w:tabs>
+        <w:ind w:left="3600" w:hanging="360"/>
+      </w:pPr>
+      <w:rPr>
+        <w:rFonts w:ascii="Wingdings" w:hAnsi="Wingdings" w:hint="default"/>
+        <w:sz w:val="20"/>
+      </w:rPr>
+    </w:lvl>
+    <w:lvl w:ilvl="5" w:tentative="1">
+      <w:start w:val="1"/>
+      <w:numFmt w:val="bullet"/>
+      <w:lvlText w:val=""/>
+      <w:lvlJc w:val="left"/>
+      <w:pPr>
+        <w:tabs>
+          <w:tab w:val="num" w:pos="4320"/>
+        </w:tabs>
+        <w:ind w:left="4320" w:hanging="360"/>
+      </w:pPr>
+      <w:rPr>
+        <w:rFonts w:ascii="Wingdings" w:hAnsi="Wingdings" w:hint="default"/>
+        <w:sz w:val="20"/>
+      </w:rPr>
+    </w:lvl>
+    <w:lvl w:ilvl="6" w:tentative="1">
+      <w:start w:val="1"/>
+      <w:numFmt w:val="bullet"/>
+      <w:lvlText w:val=""/>
+      <w:lvlJc w:val="left"/>
+      <w:pPr>
+        <w:tabs>
+          <w:tab w:val="num" w:pos="5040"/>
+        </w:tabs>
+        <w:ind w:left="5040" w:hanging="360"/>
+      </w:pPr>
+      <w:rPr>
+        <w:rFonts w:ascii="Wingdings" w:hAnsi="Wingdings" w:hint="default"/>
+        <w:sz w:val="20"/>
+      </w:rPr>
+    </w:lvl>
+    <w:lvl w:ilvl="7" w:tentative="1">
+      <w:start w:val="1"/>
+      <w:numFmt w:val="bullet"/>
+      <w:lvlText w:val=""/>
+      <w:lvlJc w:val="left"/>
+      <w:pPr>
+        <w:tabs>
+          <w:tab w:val="num" w:pos="5760"/>
+        </w:tabs>
+        <w:ind w:left="5760" w:hanging="360"/>
+      </w:pPr>
+      <w:rPr>
+        <w:rFonts w:ascii="Wingdings" w:hAnsi="Wingdings" w:hint="default"/>
+        <w:sz w:val="20"/>
+      </w:rPr>
+    </w:lvl>
+    <w:lvl w:ilvl="8" w:tentative="1">
+      <w:start w:val="1"/>
+      <w:numFmt w:val="bullet"/>
+      <w:lvlText w:val=""/>
+      <w:lvlJc w:val="left"/>
+      <w:pPr>
+        <w:tabs>
+          <w:tab w:val="num" w:pos="6480"/>
+        </w:tabs>
+        <w:ind w:left="6480" w:hanging="360"/>
+      </w:pPr>
+      <w:rPr>
+        <w:rFonts w:ascii="Wingdings" w:hAnsi="Wingdings" w:hint="default"/>
+        <w:sz w:val="20"/>
+      </w:rPr>
+    </w:lvl>
+  </w:abstractNum>
+  <w:abstractNum w:abstractNumId="4" w15:restartNumberingAfterBreak="0">
+    <w:nsid w:val="43F960E3"/>
+    <w:multiLevelType w:val="multilevel"/>
+    <w:tmpl w:val="6F489814"/>
+    <w:lvl w:ilvl="0">
+      <w:start w:val="1"/>
+      <w:numFmt w:val="bullet"/>
+      <w:lvlText w:val=""/>
+      <w:lvlJc w:val="left"/>
+      <w:pPr>
+        <w:tabs>
+          <w:tab w:val="num" w:pos="720"/>
+        </w:tabs>
+        <w:ind w:left="720" w:hanging="360"/>
+      </w:pPr>
+      <w:rPr>
+        <w:rFonts w:ascii="Symbol" w:hAnsi="Symbol" w:hint="default"/>
+        <w:sz w:val="20"/>
+      </w:rPr>
+    </w:lvl>
+    <w:lvl w:ilvl="1" w:tentative="1">
+      <w:start w:val="1"/>
+      <w:numFmt w:val="bullet"/>
+      <w:lvlText w:val="o"/>
+      <w:lvlJc w:val="left"/>
+      <w:pPr>
+        <w:tabs>
+          <w:tab w:val="num" w:pos="1440"/>
+        </w:tabs>
+        <w:ind w:left="1440" w:hanging="360"/>
+      </w:pPr>
+      <w:rPr>
+        <w:rFonts w:ascii="Courier New" w:hAnsi="Courier New" w:hint="default"/>
+        <w:sz w:val="20"/>
+      </w:rPr>
+    </w:lvl>
+    <w:lvl w:ilvl="2" w:tentative="1">
+      <w:start w:val="1"/>
+      <w:numFmt w:val="bullet"/>
+      <w:lvlText w:val=""/>
+      <w:lvlJc w:val="left"/>
+      <w:pPr>
+        <w:tabs>
+          <w:tab w:val="num" w:pos="2160"/>
+        </w:tabs>
+        <w:ind w:left="2160" w:hanging="360"/>
+      </w:pPr>
+      <w:rPr>
+        <w:rFonts w:ascii="Wingdings" w:hAnsi="Wingdings" w:hint="default"/>
+        <w:sz w:val="20"/>
+      </w:rPr>
+    </w:lvl>
+    <w:lvl w:ilvl="3" w:tentative="1">
+      <w:start w:val="1"/>
+      <w:numFmt w:val="bullet"/>
+      <w:lvlText w:val=""/>
+      <w:lvlJc w:val="left"/>
+      <w:pPr>
+        <w:tabs>
+          <w:tab w:val="num" w:pos="2880"/>
+        </w:tabs>
+        <w:ind w:left="2880" w:hanging="360"/>
+      </w:pPr>
+      <w:rPr>
+        <w:rFonts w:ascii="Wingdings" w:hAnsi="Wingdings" w:hint="default"/>
+        <w:sz w:val="20"/>
+      </w:rPr>
+    </w:lvl>
+    <w:lvl w:ilvl="4" w:tentative="1">
+      <w:start w:val="1"/>
+      <w:numFmt w:val="bullet"/>
+      <w:lvlText w:val=""/>
+      <w:lvlJc w:val="left"/>
+      <w:pPr>
+        <w:tabs>
+          <w:tab w:val="num" w:pos="3600"/>
+        </w:tabs>
+        <w:ind w:left="3600" w:hanging="360"/>
+      </w:pPr>
+      <w:rPr>
+        <w:rFonts w:ascii="Wingdings" w:hAnsi="Wingdings" w:hint="default"/>
+        <w:sz w:val="20"/>
+      </w:rPr>
+    </w:lvl>
+    <w:lvl w:ilvl="5" w:tentative="1">
+      <w:start w:val="1"/>
+      <w:numFmt w:val="bullet"/>
+      <w:lvlText w:val=""/>
+      <w:lvlJc w:val="left"/>
+      <w:pPr>
+        <w:tabs>
+          <w:tab w:val="num" w:pos="4320"/>
+        </w:tabs>
+        <w:ind w:left="4320" w:hanging="360"/>
+      </w:pPr>
+      <w:rPr>
+        <w:rFonts w:ascii="Wingdings" w:hAnsi="Wingdings" w:hint="default"/>
+        <w:sz w:val="20"/>
+      </w:rPr>
+    </w:lvl>
+    <w:lvl w:ilvl="6" w:tentative="1">
+      <w:start w:val="1"/>
+      <w:numFmt w:val="bullet"/>
+      <w:lvlText w:val=""/>
+      <w:lvlJc w:val="left"/>
+      <w:pPr>
+        <w:tabs>
+          <w:tab w:val="num" w:pos="5040"/>
+        </w:tabs>
+        <w:ind w:left="5040" w:hanging="360"/>
+      </w:pPr>
+      <w:rPr>
+        <w:rFonts w:ascii="Wingdings" w:hAnsi="Wingdings" w:hint="default"/>
+        <w:sz w:val="20"/>
+      </w:rPr>
+    </w:lvl>
+    <w:lvl w:ilvl="7" w:tentative="1">
+      <w:start w:val="1"/>
+      <w:numFmt w:val="bullet"/>
+      <w:lvlText w:val=""/>
+      <w:lvlJc w:val="left"/>
+      <w:pPr>
+        <w:tabs>
+          <w:tab w:val="num" w:pos="5760"/>
+        </w:tabs>
+        <w:ind w:left="5760" w:hanging="360"/>
+      </w:pPr>
+      <w:rPr>
+        <w:rFonts w:ascii="Wingdings" w:hAnsi="Wingdings" w:hint="default"/>
+        <w:sz w:val="20"/>
+      </w:rPr>
+    </w:lvl>
+    <w:lvl w:ilvl="8" w:tentative="1">
+      <w:start w:val="1"/>
+      <w:numFmt w:val="bullet"/>
+      <w:lvlText w:val=""/>
+      <w:lvlJc w:val="left"/>
+      <w:pPr>
+        <w:tabs>
+          <w:tab w:val="num" w:pos="6480"/>
+        </w:tabs>
+        <w:ind w:left="6480" w:hanging="360"/>
+      </w:pPr>
+      <w:rPr>
+        <w:rFonts w:ascii="Wingdings" w:hAnsi="Wingdings" w:hint="default"/>
+        <w:sz w:val="20"/>
+      </w:rPr>
+    </w:lvl>
+  </w:abstractNum>
+  <w:abstractNum w:abstractNumId="5" w15:restartNumberingAfterBreak="0">
+    <w:nsid w:val="4FE01353"/>
+    <w:multiLevelType w:val="multilevel"/>
+    <w:tmpl w:val="054A4820"/>
+    <w:lvl w:ilvl="0">
+      <w:start w:val="1"/>
+      <w:numFmt w:val="bullet"/>
+      <w:lvlText w:val=""/>
+      <w:lvlJc w:val="left"/>
+      <w:pPr>
+        <w:tabs>
+          <w:tab w:val="num" w:pos="720"/>
+        </w:tabs>
+        <w:ind w:left="720" w:hanging="360"/>
+      </w:pPr>
+      <w:rPr>
+        <w:rFonts w:ascii="Symbol" w:hAnsi="Symbol" w:hint="default"/>
+        <w:sz w:val="20"/>
+      </w:rPr>
+    </w:lvl>
+    <w:lvl w:ilvl="1" w:tentative="1">
+      <w:start w:val="1"/>
+      <w:numFmt w:val="bullet"/>
+      <w:lvlText w:val="o"/>
+      <w:lvlJc w:val="left"/>
+      <w:pPr>
+        <w:tabs>
+          <w:tab w:val="num" w:pos="1440"/>
+        </w:tabs>
+        <w:ind w:left="1440" w:hanging="360"/>
+      </w:pPr>
+      <w:rPr>
+        <w:rFonts w:ascii="Courier New" w:hAnsi="Courier New" w:hint="default"/>
+        <w:sz w:val="20"/>
+      </w:rPr>
+    </w:lvl>
+    <w:lvl w:ilvl="2" w:tentative="1">
+      <w:start w:val="1"/>
+      <w:numFmt w:val="bullet"/>
+      <w:lvlText w:val=""/>
+      <w:lvlJc w:val="left"/>
+      <w:pPr>
+        <w:tabs>
+          <w:tab w:val="num" w:pos="2160"/>
+        </w:tabs>
+        <w:ind w:left="2160" w:hanging="360"/>
+      </w:pPr>
+      <w:rPr>
+        <w:rFonts w:ascii="Wingdings" w:hAnsi="Wingdings" w:hint="default"/>
+        <w:sz w:val="20"/>
+      </w:rPr>
+    </w:lvl>
+    <w:lvl w:ilvl="3" w:tentative="1">
+      <w:start w:val="1"/>
+      <w:numFmt w:val="bullet"/>
+      <w:lvlText w:val=""/>
+      <w:lvlJc w:val="left"/>
+      <w:pPr>
+        <w:tabs>
+          <w:tab w:val="num" w:pos="2880"/>
+        </w:tabs>
+        <w:ind w:left="2880" w:hanging="360"/>
+      </w:pPr>
+      <w:rPr>
+        <w:rFonts w:ascii="Wingdings" w:hAnsi="Wingdings" w:hint="default"/>
+        <w:sz w:val="20"/>
+      </w:rPr>
+    </w:lvl>
+    <w:lvl w:ilvl="4" w:tentative="1">
+      <w:start w:val="1"/>
+      <w:numFmt w:val="bullet"/>
+      <w:lvlText w:val=""/>
+      <w:lvlJc w:val="left"/>
+      <w:pPr>
+        <w:tabs>
+          <w:tab w:val="num" w:pos="3600"/>
+        </w:tabs>
+        <w:ind w:left="3600" w:hanging="360"/>
+      </w:pPr>
+      <w:rPr>
+        <w:rFonts w:ascii="Wingdings" w:hAnsi="Wingdings" w:hint="default"/>
+        <w:sz w:val="20"/>
+      </w:rPr>
+    </w:lvl>
+    <w:lvl w:ilvl="5" w:tentative="1">
+      <w:start w:val="1"/>
+      <w:numFmt w:val="bullet"/>
+      <w:lvlText w:val=""/>
+      <w:lvlJc w:val="left"/>
+      <w:pPr>
+        <w:tabs>
+          <w:tab w:val="num" w:pos="4320"/>
+        </w:tabs>
+        <w:ind w:left="4320" w:hanging="360"/>
+      </w:pPr>
+      <w:rPr>
+        <w:rFonts w:ascii="Wingdings" w:hAnsi="Wingdings" w:hint="default"/>
+        <w:sz w:val="20"/>
+      </w:rPr>
+    </w:lvl>
+    <w:lvl w:ilvl="6" w:tentative="1">
+      <w:start w:val="1"/>
+      <w:numFmt w:val="bullet"/>
+      <w:lvlText w:val=""/>
+      <w:lvlJc w:val="left"/>
+      <w:pPr>
+        <w:tabs>
+          <w:tab w:val="num" w:pos="5040"/>
+        </w:tabs>
+        <w:ind w:left="5040" w:hanging="360"/>
+      </w:pPr>
+      <w:rPr>
+        <w:rFonts w:ascii="Wingdings" w:hAnsi="Wingdings" w:hint="default"/>
+        <w:sz w:val="20"/>
+      </w:rPr>
+    </w:lvl>
+    <w:lvl w:ilvl="7" w:tentative="1">
+      <w:start w:val="1"/>
+      <w:numFmt w:val="bullet"/>
+      <w:lvlText w:val=""/>
+      <w:lvlJc w:val="left"/>
+      <w:pPr>
+        <w:tabs>
+          <w:tab w:val="num" w:pos="5760"/>
+        </w:tabs>
+        <w:ind w:left="5760" w:hanging="360"/>
+      </w:pPr>
+      <w:rPr>
+        <w:rFonts w:ascii="Wingdings" w:hAnsi="Wingdings" w:hint="default"/>
+        <w:sz w:val="20"/>
+      </w:rPr>
+    </w:lvl>
+    <w:lvl w:ilvl="8" w:tentative="1">
+      <w:start w:val="1"/>
+      <w:numFmt w:val="bullet"/>
+      <w:lvlText w:val=""/>
+      <w:lvlJc w:val="left"/>
+      <w:pPr>
+        <w:tabs>
+          <w:tab w:val="num" w:pos="6480"/>
+        </w:tabs>
+        <w:ind w:left="6480" w:hanging="360"/>
+      </w:pPr>
+      <w:rPr>
+        <w:rFonts w:ascii="Wingdings" w:hAnsi="Wingdings" w:hint="default"/>
+        <w:sz w:val="20"/>
+      </w:rPr>
+    </w:lvl>
+  </w:abstractNum>
+  <w:abstractNum w:abstractNumId="6" w15:restartNumberingAfterBreak="0">
+    <w:nsid w:val="563623BB"/>
+    <w:multiLevelType w:val="multilevel"/>
+    <w:tmpl w:val="CEC4E4D6"/>
+    <w:lvl w:ilvl="0">
+      <w:start w:val="1"/>
+      <w:numFmt w:val="bullet"/>
+      <w:lvlText w:val=""/>
+      <w:lvlJc w:val="left"/>
+      <w:pPr>
+        <w:tabs>
+          <w:tab w:val="num" w:pos="720"/>
+        </w:tabs>
+        <w:ind w:left="720" w:hanging="360"/>
+      </w:pPr>
+      <w:rPr>
+        <w:rFonts w:ascii="Symbol" w:hAnsi="Symbol" w:hint="default"/>
+        <w:sz w:val="20"/>
+      </w:rPr>
+    </w:lvl>
+    <w:lvl w:ilvl="1" w:tentative="1">
+      <w:start w:val="1"/>
+      <w:numFmt w:val="bullet"/>
+      <w:lvlText w:val="o"/>
+      <w:lvlJc w:val="left"/>
+      <w:pPr>
+        <w:tabs>
+          <w:tab w:val="num" w:pos="1440"/>
+        </w:tabs>
+        <w:ind w:left="1440" w:hanging="360"/>
+      </w:pPr>
+      <w:rPr>
+        <w:rFonts w:ascii="Courier New" w:hAnsi="Courier New" w:hint="default"/>
+        <w:sz w:val="20"/>
+      </w:rPr>
+    </w:lvl>
+    <w:lvl w:ilvl="2" w:tentative="1">
+      <w:start w:val="1"/>
+      <w:numFmt w:val="bullet"/>
+      <w:lvlText w:val=""/>
+      <w:lvlJc w:val="left"/>
+      <w:pPr>
+        <w:tabs>
+          <w:tab w:val="num" w:pos="2160"/>
+        </w:tabs>
+        <w:ind w:left="2160" w:hanging="360"/>
+      </w:pPr>
+      <w:rPr>
+        <w:rFonts w:ascii="Wingdings" w:hAnsi="Wingdings" w:hint="default"/>
+        <w:sz w:val="20"/>
+      </w:rPr>
+    </w:lvl>
+    <w:lvl w:ilvl="3" w:tentative="1">
+      <w:start w:val="1"/>
+      <w:numFmt w:val="bullet"/>
+      <w:lvlText w:val=""/>
+      <w:lvlJc w:val="left"/>
+      <w:pPr>
+        <w:tabs>
+          <w:tab w:val="num" w:pos="2880"/>
+        </w:tabs>
+        <w:ind w:left="2880" w:hanging="360"/>
+      </w:pPr>
+      <w:rPr>
+        <w:rFonts w:ascii="Wingdings" w:hAnsi="Wingdings" w:hint="default"/>
+        <w:sz w:val="20"/>
+      </w:rPr>
+    </w:lvl>
+    <w:lvl w:ilvl="4" w:tentative="1">
+      <w:start w:val="1"/>
+      <w:numFmt w:val="bullet"/>
+      <w:lvlText w:val=""/>
+      <w:lvlJc w:val="left"/>
+      <w:pPr>
+        <w:tabs>
+          <w:tab w:val="num" w:pos="3600"/>
+        </w:tabs>
+        <w:ind w:left="3600" w:hanging="360"/>
+      </w:pPr>
+      <w:rPr>
+        <w:rFonts w:ascii="Wingdings" w:hAnsi="Wingdings" w:hint="default"/>
+        <w:sz w:val="20"/>
+      </w:rPr>
+    </w:lvl>
+    <w:lvl w:ilvl="5" w:tentative="1">
+      <w:start w:val="1"/>
+      <w:numFmt w:val="bullet"/>
+      <w:lvlText w:val=""/>
+      <w:lvlJc w:val="left"/>
+      <w:pPr>
+        <w:tabs>
+          <w:tab w:val="num" w:pos="4320"/>
+        </w:tabs>
+        <w:ind w:left="4320" w:hanging="360"/>
+      </w:pPr>
+      <w:rPr>
+        <w:rFonts w:ascii="Wingdings" w:hAnsi="Wingdings" w:hint="default"/>
+        <w:sz w:val="20"/>
+      </w:rPr>
+    </w:lvl>
+    <w:lvl w:ilvl="6" w:tentative="1">
+      <w:start w:val="1"/>
+      <w:numFmt w:val="bullet"/>
+      <w:lvlText w:val=""/>
+      <w:lvlJc w:val="left"/>
+      <w:pPr>
+        <w:tabs>
+          <w:tab w:val="num" w:pos="5040"/>
+        </w:tabs>
+        <w:ind w:left="5040" w:hanging="360"/>
+      </w:pPr>
+      <w:rPr>
+        <w:rFonts w:ascii="Wingdings" w:hAnsi="Wingdings" w:hint="default"/>
+        <w:sz w:val="20"/>
+      </w:rPr>
+    </w:lvl>
+    <w:lvl w:ilvl="7" w:tentative="1">
+      <w:start w:val="1"/>
+      <w:numFmt w:val="bullet"/>
+      <w:lvlText w:val=""/>
+      <w:lvlJc w:val="left"/>
+      <w:pPr>
+        <w:tabs>
+          <w:tab w:val="num" w:pos="5760"/>
+        </w:tabs>
+        <w:ind w:left="5760" w:hanging="360"/>
+      </w:pPr>
+      <w:rPr>
+        <w:rFonts w:ascii="Wingdings" w:hAnsi="Wingdings" w:hint="default"/>
+        <w:sz w:val="20"/>
+      </w:rPr>
+    </w:lvl>
+    <w:lvl w:ilvl="8" w:tentative="1">
+      <w:start w:val="1"/>
+      <w:numFmt w:val="bullet"/>
+      <w:lvlText w:val=""/>
+      <w:lvlJc w:val="left"/>
+      <w:pPr>
+        <w:tabs>
+          <w:tab w:val="num" w:pos="6480"/>
+        </w:tabs>
+        <w:ind w:left="6480" w:hanging="360"/>
+      </w:pPr>
+      <w:rPr>
+        <w:rFonts w:ascii="Wingdings" w:hAnsi="Wingdings" w:hint="default"/>
+        <w:sz w:val="20"/>
+      </w:rPr>
+    </w:lvl>
+  </w:abstractNum>
+  <w:abstractNum w:abstractNumId="7" w15:restartNumberingAfterBreak="0">
+    <w:nsid w:val="59DB658F"/>
+    <w:multiLevelType w:val="multilevel"/>
+    <w:tmpl w:val="B7D4B966"/>
+    <w:lvl w:ilvl="0">
+      <w:start w:val="1"/>
+      <w:numFmt w:val="bullet"/>
+      <w:lvlText w:val=""/>
+      <w:lvlJc w:val="left"/>
+      <w:pPr>
+        <w:tabs>
+          <w:tab w:val="num" w:pos="720"/>
+        </w:tabs>
+        <w:ind w:left="720" w:hanging="360"/>
+      </w:pPr>
+      <w:rPr>
+        <w:rFonts w:ascii="Symbol" w:hAnsi="Symbol" w:hint="default"/>
+        <w:sz w:val="20"/>
+      </w:rPr>
+    </w:lvl>
+    <w:lvl w:ilvl="1" w:tentative="1">
+      <w:start w:val="1"/>
+      <w:numFmt w:val="bullet"/>
+      <w:lvlText w:val="o"/>
+      <w:lvlJc w:val="left"/>
+      <w:pPr>
+        <w:tabs>
+          <w:tab w:val="num" w:pos="1440"/>
+        </w:tabs>
+        <w:ind w:left="1440" w:hanging="360"/>
+      </w:pPr>
+      <w:rPr>
+        <w:rFonts w:ascii="Courier New" w:hAnsi="Courier New" w:hint="default"/>
+        <w:sz w:val="20"/>
+      </w:rPr>
+    </w:lvl>
+    <w:lvl w:ilvl="2" w:tentative="1">
+      <w:start w:val="1"/>
+      <w:numFmt w:val="bullet"/>
+      <w:lvlText w:val=""/>
+      <w:lvlJc w:val="left"/>
+      <w:pPr>
+        <w:tabs>
+          <w:tab w:val="num" w:pos="2160"/>
+        </w:tabs>
+        <w:ind w:left="2160" w:hanging="360"/>
+      </w:pPr>
+      <w:rPr>
+        <w:rFonts w:ascii="Wingdings" w:hAnsi="Wingdings" w:hint="default"/>
+        <w:sz w:val="20"/>
+      </w:rPr>
+    </w:lvl>
+    <w:lvl w:ilvl="3" w:tentative="1">
+      <w:start w:val="1"/>
+      <w:numFmt w:val="bullet"/>
+      <w:lvlText w:val=""/>
+      <w:lvlJc w:val="left"/>
+      <w:pPr>
+        <w:tabs>
+          <w:tab w:val="num" w:pos="2880"/>
+        </w:tabs>
+        <w:ind w:left="2880" w:hanging="360"/>
+      </w:pPr>
+      <w:rPr>
+        <w:rFonts w:ascii="Wingdings" w:hAnsi="Wingdings" w:hint="default"/>
+        <w:sz w:val="20"/>
+      </w:rPr>
+    </w:lvl>
+    <w:lvl w:ilvl="4" w:tentative="1">
+      <w:start w:val="1"/>
+      <w:numFmt w:val="bullet"/>
+      <w:lvlText w:val=""/>
+      <w:lvlJc w:val="left"/>
+      <w:pPr>
+        <w:tabs>
+          <w:tab w:val="num" w:pos="3600"/>
+        </w:tabs>
+        <w:ind w:left="3600" w:hanging="360"/>
+      </w:pPr>
+      <w:rPr>
+        <w:rFonts w:ascii="Wingdings" w:hAnsi="Wingdings" w:hint="default"/>
+        <w:sz w:val="20"/>
+      </w:rPr>
+    </w:lvl>
+    <w:lvl w:ilvl="5" w:tentative="1">
+      <w:start w:val="1"/>
+      <w:numFmt w:val="bullet"/>
+      <w:lvlText w:val=""/>
+      <w:lvlJc w:val="left"/>
+      <w:pPr>
+        <w:tabs>
+          <w:tab w:val="num" w:pos="4320"/>
+        </w:tabs>
+        <w:ind w:left="4320" w:hanging="360"/>
+      </w:pPr>
+      <w:rPr>
+        <w:rFonts w:ascii="Wingdings" w:hAnsi="Wingdings" w:hint="default"/>
+        <w:sz w:val="20"/>
+      </w:rPr>
+    </w:lvl>
+    <w:lvl w:ilvl="6" w:tentative="1">
+      <w:start w:val="1"/>
+      <w:numFmt w:val="bullet"/>
+      <w:lvlText w:val=""/>
+      <w:lvlJc w:val="left"/>
+      <w:pPr>
+        <w:tabs>
+          <w:tab w:val="num" w:pos="5040"/>
+        </w:tabs>
+        <w:ind w:left="5040" w:hanging="360"/>
+      </w:pPr>
+      <w:rPr>
+        <w:rFonts w:ascii="Wingdings" w:hAnsi="Wingdings" w:hint="default"/>
+        <w:sz w:val="20"/>
+      </w:rPr>
+    </w:lvl>
+    <w:lvl w:ilvl="7" w:tentative="1">
+      <w:start w:val="1"/>
+      <w:numFmt w:val="bullet"/>
+      <w:lvlText w:val=""/>
+      <w:lvlJc w:val="left"/>
+      <w:pPr>
+        <w:tabs>
+          <w:tab w:val="num" w:pos="5760"/>
+        </w:tabs>
+        <w:ind w:left="5760" w:hanging="360"/>
+      </w:pPr>
+      <w:rPr>
+        <w:rFonts w:ascii="Wingdings" w:hAnsi="Wingdings" w:hint="default"/>
+        <w:sz w:val="20"/>
+      </w:rPr>
+    </w:lvl>
+    <w:lvl w:ilvl="8" w:tentative="1">
+      <w:start w:val="1"/>
+      <w:numFmt w:val="bullet"/>
+      <w:lvlText w:val=""/>
+      <w:lvlJc w:val="left"/>
+      <w:pPr>
+        <w:tabs>
+          <w:tab w:val="num" w:pos="6480"/>
+        </w:tabs>
+        <w:ind w:left="6480" w:hanging="360"/>
+      </w:pPr>
+      <w:rPr>
+        <w:rFonts w:ascii="Wingdings" w:hAnsi="Wingdings" w:hint="default"/>
+        <w:sz w:val="20"/>
+      </w:rPr>
+    </w:lvl>
+  </w:abstractNum>
+  <w:abstractNum w:abstractNumId="8" w15:restartNumberingAfterBreak="0">
+    <w:nsid w:val="5BA8083E"/>
+    <w:multiLevelType w:val="multilevel"/>
+    <w:tmpl w:val="C99618B8"/>
+    <w:lvl w:ilvl="0">
+      <w:start w:val="1"/>
+      <w:numFmt w:val="bullet"/>
+      <w:lvlText w:val=""/>
+      <w:lvlJc w:val="left"/>
+      <w:pPr>
+        <w:tabs>
+          <w:tab w:val="num" w:pos="720"/>
+        </w:tabs>
+        <w:ind w:left="720" w:hanging="360"/>
+      </w:pPr>
+      <w:rPr>
+        <w:rFonts w:ascii="Symbol" w:hAnsi="Symbol" w:hint="default"/>
+        <w:sz w:val="20"/>
+      </w:rPr>
+    </w:lvl>
+    <w:lvl w:ilvl="1" w:tentative="1">
+      <w:start w:val="1"/>
+      <w:numFmt w:val="bullet"/>
+      <w:lvlText w:val="o"/>
+      <w:lvlJc w:val="left"/>
+      <w:pPr>
+        <w:tabs>
+          <w:tab w:val="num" w:pos="1440"/>
+        </w:tabs>
+        <w:ind w:left="1440" w:hanging="360"/>
+      </w:pPr>
+      <w:rPr>
+        <w:rFonts w:ascii="Courier New" w:hAnsi="Courier New" w:hint="default"/>
+        <w:sz w:val="20"/>
+      </w:rPr>
+    </w:lvl>
+    <w:lvl w:ilvl="2" w:tentative="1">
+      <w:start w:val="1"/>
+      <w:numFmt w:val="bullet"/>
+      <w:lvlText w:val=""/>
+      <w:lvlJc w:val="left"/>
+      <w:pPr>
+        <w:tabs>
+          <w:tab w:val="num" w:pos="2160"/>
+        </w:tabs>
+        <w:ind w:left="2160" w:hanging="360"/>
+      </w:pPr>
+      <w:rPr>
+        <w:rFonts w:ascii="Wingdings" w:hAnsi="Wingdings" w:hint="default"/>
+        <w:sz w:val="20"/>
+      </w:rPr>
+    </w:lvl>
+    <w:lvl w:ilvl="3" w:tentative="1">
+      <w:start w:val="1"/>
+      <w:numFmt w:val="bullet"/>
+      <w:lvlText w:val=""/>
+      <w:lvlJc w:val="left"/>
+      <w:pPr>
+        <w:tabs>
+          <w:tab w:val="num" w:pos="2880"/>
+        </w:tabs>
+        <w:ind w:left="2880" w:hanging="360"/>
+      </w:pPr>
+      <w:rPr>
+        <w:rFonts w:ascii="Wingdings" w:hAnsi="Wingdings" w:hint="default"/>
+        <w:sz w:val="20"/>
+      </w:rPr>
+    </w:lvl>
+    <w:lvl w:ilvl="4" w:tentative="1">
+      <w:start w:val="1"/>
+      <w:numFmt w:val="bullet"/>
+      <w:lvlText w:val=""/>
+      <w:lvlJc w:val="left"/>
+      <w:pPr>
+        <w:tabs>
+          <w:tab w:val="num" w:pos="3600"/>
+        </w:tabs>
+        <w:ind w:left="3600" w:hanging="360"/>
+      </w:pPr>
+      <w:rPr>
+        <w:rFonts w:ascii="Wingdings" w:hAnsi="Wingdings" w:hint="default"/>
+        <w:sz w:val="20"/>
+      </w:rPr>
+    </w:lvl>
+    <w:lvl w:ilvl="5" w:tentative="1">
+      <w:start w:val="1"/>
+      <w:numFmt w:val="bullet"/>
+      <w:lvlText w:val=""/>
+      <w:lvlJc w:val="left"/>
+      <w:pPr>
+        <w:tabs>
+          <w:tab w:val="num" w:pos="4320"/>
+        </w:tabs>
+        <w:ind w:left="4320" w:hanging="360"/>
+      </w:pPr>
+      <w:rPr>
+        <w:rFonts w:ascii="Wingdings" w:hAnsi="Wingdings" w:hint="default"/>
+        <w:sz w:val="20"/>
+      </w:rPr>
+    </w:lvl>
+    <w:lvl w:ilvl="6" w:tentative="1">
+      <w:start w:val="1"/>
+      <w:numFmt w:val="bullet"/>
+      <w:lvlText w:val=""/>
+      <w:lvlJc w:val="left"/>
+      <w:pPr>
+        <w:tabs>
+          <w:tab w:val="num" w:pos="5040"/>
+        </w:tabs>
+        <w:ind w:left="5040" w:hanging="360"/>
+      </w:pPr>
+      <w:rPr>
+        <w:rFonts w:ascii="Wingdings" w:hAnsi="Wingdings" w:hint="default"/>
+        <w:sz w:val="20"/>
+      </w:rPr>
+    </w:lvl>
+    <w:lvl w:ilvl="7" w:tentative="1">
+      <w:start w:val="1"/>
+      <w:numFmt w:val="bullet"/>
+      <w:lvlText w:val=""/>
+      <w:lvlJc w:val="left"/>
+      <w:pPr>
+        <w:tabs>
+          <w:tab w:val="num" w:pos="5760"/>
+        </w:tabs>
+        <w:ind w:left="5760" w:hanging="360"/>
+      </w:pPr>
+      <w:rPr>
+        <w:rFonts w:ascii="Wingdings" w:hAnsi="Wingdings" w:hint="default"/>
+        <w:sz w:val="20"/>
+      </w:rPr>
+    </w:lvl>
+    <w:lvl w:ilvl="8" w:tentative="1">
+      <w:start w:val="1"/>
+      <w:numFmt w:val="bullet"/>
+      <w:lvlText w:val=""/>
+      <w:lvlJc w:val="left"/>
+      <w:pPr>
+        <w:tabs>
+          <w:tab w:val="num" w:pos="6480"/>
+        </w:tabs>
+        <w:ind w:left="6480" w:hanging="360"/>
+      </w:pPr>
+      <w:rPr>
+        <w:rFonts w:ascii="Wingdings" w:hAnsi="Wingdings" w:hint="default"/>
+        <w:sz w:val="20"/>
+      </w:rPr>
+    </w:lvl>
+  </w:abstractNum>
+  <w:abstractNum w:abstractNumId="9" w15:restartNumberingAfterBreak="0">
+    <w:nsid w:val="73584F1C"/>
+    <w:multiLevelType w:val="multilevel"/>
+    <w:tmpl w:val="5AF6F454"/>
+    <w:lvl w:ilvl="0">
+      <w:start w:val="1"/>
+      <w:numFmt w:val="decimal"/>
+      <w:lvlText w:val="%1."/>
+      <w:lvlJc w:val="left"/>
+      <w:pPr>
+        <w:tabs>
+          <w:tab w:val="num" w:pos="720"/>
+        </w:tabs>
+        <w:ind w:left="720" w:hanging="360"/>
+      </w:pPr>
+    </w:lvl>
+    <w:lvl w:ilvl="1" w:tentative="1">
+      <w:start w:val="1"/>
+      <w:numFmt w:val="decimal"/>
+      <w:lvlText w:val="%2."/>
+      <w:lvlJc w:val="left"/>
+      <w:pPr>
+        <w:tabs>
+          <w:tab w:val="num" w:pos="1440"/>
+        </w:tabs>
+        <w:ind w:left="1440" w:hanging="360"/>
+      </w:pPr>
+    </w:lvl>
+    <w:lvl w:ilvl="2" w:tentative="1">
+      <w:start w:val="1"/>
+      <w:numFmt w:val="decimal"/>
+      <w:lvlText w:val="%3."/>
+      <w:lvlJc w:val="left"/>
+      <w:pPr>
+        <w:tabs>
+          <w:tab w:val="num" w:pos="2160"/>
+        </w:tabs>
+        <w:ind w:left="2160" w:hanging="360"/>
+      </w:pPr>
+    </w:lvl>
+    <w:lvl w:ilvl="3" w:tentative="1">
+      <w:start w:val="1"/>
+      <w:numFmt w:val="decimal"/>
+      <w:lvlText w:val="%4."/>
+      <w:lvlJc w:val="left"/>
+      <w:pPr>
+        <w:tabs>
+          <w:tab w:val="num" w:pos="2880"/>
+        </w:tabs>
+        <w:ind w:left="2880" w:hanging="360"/>
+      </w:pPr>
+    </w:lvl>
+    <w:lvl w:ilvl="4" w:tentative="1">
+      <w:start w:val="1"/>
+      <w:numFmt w:val="decimal"/>
+      <w:lvlText w:val="%5."/>
+      <w:lvlJc w:val="left"/>
+      <w:pPr>
+        <w:tabs>
+          <w:tab w:val="num" w:pos="3600"/>
+        </w:tabs>
+        <w:ind w:left="3600" w:hanging="360"/>
+      </w:pPr>
+    </w:lvl>
+    <w:lvl w:ilvl="5" w:tentative="1">
+      <w:start w:val="1"/>
+      <w:numFmt w:val="decimal"/>
+      <w:lvlText w:val="%6."/>
+      <w:lvlJc w:val="left"/>
+      <w:pPr>
+        <w:tabs>
+          <w:tab w:val="num" w:pos="4320"/>
+        </w:tabs>
+        <w:ind w:left="4320" w:hanging="360"/>
+      </w:pPr>
+    </w:lvl>
+    <w:lvl w:ilvl="6" w:tentative="1">
+      <w:start w:val="1"/>
+      <w:numFmt w:val="decimal"/>
+      <w:lvlText w:val="%7."/>
+      <w:lvlJc w:val="left"/>
+      <w:pPr>
+        <w:tabs>
+          <w:tab w:val="num" w:pos="5040"/>
+        </w:tabs>
+        <w:ind w:left="5040" w:hanging="360"/>
+      </w:pPr>
+    </w:lvl>
+    <w:lvl w:ilvl="7" w:tentative="1">
+      <w:start w:val="1"/>
+      <w:numFmt w:val="decimal"/>
+      <w:lvlText w:val="%8."/>
+      <w:lvlJc w:val="left"/>
+      <w:pPr>
+        <w:tabs>
+          <w:tab w:val="num" w:pos="5760"/>
+        </w:tabs>
+        <w:ind w:left="5760" w:hanging="360"/>
+      </w:pPr>
+    </w:lvl>
+    <w:lvl w:ilvl="8" w:tentative="1">
+      <w:start w:val="1"/>
+      <w:numFmt w:val="decimal"/>
+      <w:lvlText w:val="%9."/>
+      <w:lvlJc w:val="left"/>
+      <w:pPr>
+        <w:tabs>
+          <w:tab w:val="num" w:pos="6480"/>
+        </w:tabs>
+        <w:ind w:left="6480" w:hanging="360"/>
+      </w:pPr>
+    </w:lvl>
+  </w:abstractNum>
   <w:num w:numId="1">
+    <w:abstractNumId w:val="1"/>
+  </w:num>
+  <w:num w:numId="2">
+    <w:abstractNumId w:val="7"/>
+  </w:num>
+  <w:num w:numId="3">
+    <w:abstractNumId w:val="5"/>
+  </w:num>
+  <w:num w:numId="4">
+    <w:abstractNumId w:val="3"/>
+  </w:num>
+  <w:num w:numId="5">
+    <w:abstractNumId w:val="4"/>
+  </w:num>
+  <w:num w:numId="6">
+    <w:abstractNumId w:val="8"/>
+  </w:num>
+  <w:num w:numId="7">
+    <w:abstractNumId w:val="6"/>
+  </w:num>
+  <w:num w:numId="8">
+    <w:abstractNumId w:val="2"/>
+  </w:num>
+  <w:num w:numId="9">
     <w:abstractNumId w:val="0"/>
+  </w:num>
+  <w:num w:numId="10">
+    <w:abstractNumId w:val="9"/>
   </w:num>
 </w:numbering>
 </file>
@@ -995,6 +3892,27 @@
     <w:name w:val="Normal"/>
     <w:qFormat/>
   </w:style>
+  <w:style w:type="paragraph" w:styleId="Heading1">
+    <w:name w:val="heading 1"/>
+    <w:basedOn w:val="Normal"/>
+    <w:next w:val="Normal"/>
+    <w:link w:val="Heading1Char"/>
+    <w:uiPriority w:val="9"/>
+    <w:qFormat/>
+    <w:rsid w:val="002234F2"/>
+    <w:pPr>
+      <w:keepNext/>
+      <w:keepLines/>
+      <w:spacing w:before="240" w:after="0"/>
+      <w:outlineLvl w:val="0"/>
+    </w:pPr>
+    <w:rPr>
+      <w:rFonts w:asciiTheme="majorHAnsi" w:eastAsiaTheme="majorEastAsia" w:hAnsiTheme="majorHAnsi" w:cstheme="majorBidi"/>
+      <w:color w:val="2E74B5" w:themeColor="accent1" w:themeShade="BF"/>
+      <w:sz w:val="32"/>
+      <w:szCs w:val="32"/>
+    </w:rPr>
+  </w:style>
   <w:style w:type="paragraph" w:styleId="Heading2">
     <w:name w:val="heading 2"/>
     <w:basedOn w:val="Normal"/>
@@ -1013,6 +3931,29 @@
       <w:sz w:val="36"/>
       <w:szCs w:val="36"/>
       <w:lang w:eastAsia="en-GB"/>
+    </w:rPr>
+  </w:style>
+  <w:style w:type="paragraph" w:styleId="Heading3">
+    <w:name w:val="heading 3"/>
+    <w:basedOn w:val="Normal"/>
+    <w:next w:val="Normal"/>
+    <w:link w:val="Heading3Char"/>
+    <w:uiPriority w:val="9"/>
+    <w:semiHidden/>
+    <w:unhideWhenUsed/>
+    <w:qFormat/>
+    <w:rsid w:val="002234F2"/>
+    <w:pPr>
+      <w:keepNext/>
+      <w:keepLines/>
+      <w:spacing w:before="40" w:after="0"/>
+      <w:outlineLvl w:val="2"/>
+    </w:pPr>
+    <w:rPr>
+      <w:rFonts w:asciiTheme="majorHAnsi" w:eastAsiaTheme="majorEastAsia" w:hAnsiTheme="majorHAnsi" w:cstheme="majorBidi"/>
+      <w:color w:val="1F4D78" w:themeColor="accent1" w:themeShade="7F"/>
+      <w:sz w:val="24"/>
+      <w:szCs w:val="24"/>
     </w:rPr>
   </w:style>
   <w:style w:type="character" w:default="1" w:styleId="DefaultParagraphFont">
@@ -1083,6 +4024,33 @@
     <w:rPr>
       <w:b/>
       <w:bCs/>
+    </w:rPr>
+  </w:style>
+  <w:style w:type="character" w:customStyle="1" w:styleId="Heading1Char">
+    <w:name w:val="Heading 1 Char"/>
+    <w:basedOn w:val="DefaultParagraphFont"/>
+    <w:link w:val="Heading1"/>
+    <w:uiPriority w:val="9"/>
+    <w:rsid w:val="002234F2"/>
+    <w:rPr>
+      <w:rFonts w:asciiTheme="majorHAnsi" w:eastAsiaTheme="majorEastAsia" w:hAnsiTheme="majorHAnsi" w:cstheme="majorBidi"/>
+      <w:color w:val="2E74B5" w:themeColor="accent1" w:themeShade="BF"/>
+      <w:sz w:val="32"/>
+      <w:szCs w:val="32"/>
+    </w:rPr>
+  </w:style>
+  <w:style w:type="character" w:customStyle="1" w:styleId="Heading3Char">
+    <w:name w:val="Heading 3 Char"/>
+    <w:basedOn w:val="DefaultParagraphFont"/>
+    <w:link w:val="Heading3"/>
+    <w:uiPriority w:val="9"/>
+    <w:semiHidden/>
+    <w:rsid w:val="002234F2"/>
+    <w:rPr>
+      <w:rFonts w:asciiTheme="majorHAnsi" w:eastAsiaTheme="majorEastAsia" w:hAnsiTheme="majorHAnsi" w:cstheme="majorBidi"/>
+      <w:color w:val="1F4D78" w:themeColor="accent1" w:themeShade="7F"/>
+      <w:sz w:val="24"/>
+      <w:szCs w:val="24"/>
     </w:rPr>
   </w:style>
 </w:styles>

</xml_diff>